<commit_message>
docs: chuan hoa bao cao Giai Doan 1 dung 100% de tai Website Truyen thong Cong doan TDMU tich hop AI
</commit_message>
<xml_diff>
--- a/docs/BaoCao_GiaiDoan1_DoAnCoSoNganh.docx
+++ b/docs/BaoCao_GiaiDoan1_DoAnCoSoNganh.docx
@@ -19,25 +19,19 @@
     </w:p>
     <w:p>
       <w:pPr>
-        <w:spacing w:before="1200"/>
-      </w:pPr>
-    </w:p>
-    <w:p>
-      <w:pPr>
-        <w:spacing w:after="280"/>
+        <w:spacing w:after="800"/>
         <w:jc w:val="center"/>
       </w:pPr>
       <w:r>
         <w:rPr>
-          <w:b/>
-          <w:sz w:val="32"/>
+          <w:sz w:val="24"/>
         </w:rPr>
-        <w:t>ĐỒ ÁN CƠ SỞ NGÀNH</w:t>
+        <w:t>-------------------***-------------------</w:t>
       </w:r>
     </w:p>
     <w:p>
       <w:pPr>
-        <w:spacing w:after="1600" w:line="336" w:lineRule="auto"/>
+        <w:spacing w:after="300"/>
         <w:jc w:val="center"/>
       </w:pPr>
       <w:r>
@@ -45,13 +39,34 @@
           <w:b/>
           <w:sz w:val="30"/>
         </w:rPr>
-        <w:t>XÂY DỰNG CỔNG THÔNG TIN ĐIỆN TỬ VÀ HỆ THỐNG QUẢN LÝ BÁO CÁO THI ĐUA CÔNG ĐOÀN TRƯỜNG ĐẠI HỌC THỦ DẦU MỘT TÍCH HỢP TRỢ LÝ TRÍ TUỆ NHÂN TẠO</w:t>
+        <w:t>ĐỒ ÁN CƠ SỞ NGÀNH</w:t>
+        <w:br/>
+        <w:t>NGÀNH: CÔNG NGHỆ THÔNG TIN</w:t>
       </w:r>
     </w:p>
     <w:p>
       <w:pPr>
-        <w:spacing w:line="312" w:lineRule="auto"/>
-        <w:ind w:left="2268"/>
+        <w:spacing w:after="1000" w:line="312" w:lineRule="auto"/>
+        <w:jc w:val="center"/>
+      </w:pPr>
+      <w:r>
+        <w:rPr>
+          <w:b/>
+          <w:color w:val="002060"/>
+          <w:sz w:val="34"/>
+        </w:rPr>
+        <w:t>ĐỀ TÀI:</w:t>
+        <w:br/>
+        <w:br/>
+        <w:t>XÂY DỰNG WEBSITE TRUYỀN THÔNG CÔNG ĐOÀN TDMU</w:t>
+        <w:br/>
+        <w:t>TÍCH HỢP AI HỖ TRỢ TẠO VÀ ĐĂNG TẢI NỘI DUNG</w:t>
+      </w:r>
+    </w:p>
+    <w:p>
+      <w:pPr>
+        <w:spacing w:after="120" w:line="312" w:lineRule="auto"/>
+        <w:ind w:left="1984"/>
         <w:jc w:val="left"/>
       </w:pPr>
       <w:r>
@@ -59,116 +74,16 @@
           <w:b/>
           <w:sz w:val="26"/>
         </w:rPr>
-        <w:t>GIẢNG VIÊN: ThS. Võ Quốc Lương</w:t>
+        <w:t>GIẢNG VIÊN HƯỚNG DẪN:  ThS. Võ Quốc Lương</w:t>
         <w:br/>
         <w:br/>
-        <w:t>NHÓM THỰC HIỆN: Nhóm 2</w:t>
+        <w:t>SINH VIÊN THỰC HIỆN:    Nhóm 2</w:t>
         <w:br/>
-      </w:r>
-      <w:r>
-        <w:rPr>
-          <w:sz w:val="26"/>
-        </w:rPr>
-        <w:t xml:space="preserve"> 1. Nguyễn Bình Dương     2424802010319</w:t>
+        <w:t>1. Nguyễn Bình Dương  -  MSSV: 2424802010319  -  Lớp: D24CNTT05 (Trưởng nhóm)</w:t>
         <w:br/>
-        <w:t xml:space="preserve"> 2. Trần Hồng Thanh       2424802010439</w:t>
+        <w:t>2. Trần Hồng Thanh    -  MSSV: 2424802010439  -  Lớp: D24CNTT03</w:t>
         <w:br/>
-        <w:t xml:space="preserve"> 3. Phạm Anh Tuấn         2324802010393</w:t>
-      </w:r>
-    </w:p>
-    <w:p>
-      <w:pPr>
-        <w:spacing w:before="1800"/>
-        <w:jc w:val="center"/>
-      </w:pPr>
-      <w:r>
-        <w:rPr>
-          <w:b/>
-          <w:sz w:val="26"/>
-        </w:rPr>
-        <w:t>BÌNH DƯƠNG - 09/2026</w:t>
-      </w:r>
-    </w:p>
-    <w:p>
-      <w:r>
-        <w:br w:type="page"/>
-      </w:r>
-    </w:p>
-    <w:p>
-      <w:pPr>
-        <w:spacing w:after="40"/>
-        <w:jc w:val="center"/>
-      </w:pPr>
-      <w:r>
-        <w:rPr>
-          <w:b/>
-          <w:sz w:val="26"/>
-        </w:rPr>
-        <w:t>Đồ án cơ sở ngành                                                                                         Trang i</w:t>
-        <w:br/>
-        <w:br/>
-        <w:t>TRƯỜNG ĐẠI HỌC THỦ DẦU MỘT</w:t>
-        <w:br/>
-        <w:t>VIỆN CÔNG NGHỆ SỐ</w:t>
-      </w:r>
-    </w:p>
-    <w:p>
-      <w:pPr>
-        <w:spacing w:before="1000"/>
-      </w:pPr>
-    </w:p>
-    <w:p>
-      <w:pPr>
-        <w:spacing w:after="280"/>
-        <w:jc w:val="center"/>
-      </w:pPr>
-      <w:r>
-        <w:rPr>
-          <w:b/>
-          <w:sz w:val="32"/>
-        </w:rPr>
-        <w:t>ĐỒ ÁN CƠ SỞ NGÀNH</w:t>
-      </w:r>
-    </w:p>
-    <w:p>
-      <w:pPr>
-        <w:spacing w:after="1400" w:line="336" w:lineRule="auto"/>
-        <w:jc w:val="center"/>
-      </w:pPr>
-      <w:r>
-        <w:rPr>
-          <w:b/>
-          <w:sz w:val="30"/>
-        </w:rPr>
-        <w:t>XÂY DỰNG CỔNG THÔNG TIN ĐIỆN TỬ VÀ HỆ THỐNG QUẢN LÝ BÁO CÁO THI ĐUA CÔNG ĐOÀN TRƯỜNG ĐẠI HỌC THỦ DẦU MỘT TÍCH HỢP TRỢ LÝ TRÍ TUỆ NHÂN TẠO</w:t>
-      </w:r>
-    </w:p>
-    <w:p>
-      <w:pPr>
-        <w:spacing w:line="312" w:lineRule="auto"/>
-        <w:ind w:left="2268"/>
-        <w:jc w:val="left"/>
-      </w:pPr>
-      <w:r>
-        <w:rPr>
-          <w:b/>
-          <w:sz w:val="26"/>
-        </w:rPr>
-        <w:t>GIẢNG VIÊN: ThS. Võ Quốc Lương</w:t>
-        <w:br/>
-        <w:br/>
-        <w:t>NHÓM THỰC HIỆN: Nhóm 2</w:t>
-        <w:br/>
-      </w:r>
-      <w:r>
-        <w:rPr>
-          <w:sz w:val="26"/>
-        </w:rPr>
-        <w:t xml:space="preserve"> 1. Nguyễn Bình Dương     2424802010319</w:t>
-        <w:br/>
-        <w:t xml:space="preserve"> 2. Trần Hồng Thanh       2424802010439</w:t>
-        <w:br/>
-        <w:t xml:space="preserve"> 3. Phạm Anh Tuấn         2324802010393</w:t>
+        <w:t>3. Phạm Anh Tuấn      -  MSSV: 2324802010393  -  Lớp: D23CNTT03</w:t>
       </w:r>
     </w:p>
     <w:p>
@@ -181,7 +96,122 @@
           <w:b/>
           <w:sz w:val="26"/>
         </w:rPr>
-        <w:t>BÌNH DƯƠNG - 09/2026</w:t>
+        <w:t>BÌNH DƯƠNG, THÁNG 10/2026</w:t>
+      </w:r>
+    </w:p>
+    <w:p>
+      <w:r>
+        <w:br w:type="page"/>
+      </w:r>
+    </w:p>
+    <w:p>
+      <w:pPr>
+        <w:jc w:val="left"/>
+      </w:pPr>
+      <w:r>
+        <w:rPr>
+          <w:i/>
+          <w:sz w:val="20"/>
+        </w:rPr>
+        <w:t>Đồ án cơ sở ngành                                                                                         Trang i</w:t>
+        <w:br/>
+      </w:r>
+    </w:p>
+    <w:p>
+      <w:pPr>
+        <w:spacing w:after="40"/>
+        <w:jc w:val="center"/>
+      </w:pPr>
+      <w:r>
+        <w:rPr>
+          <w:b/>
+          <w:sz w:val="28"/>
+        </w:rPr>
+        <w:t>TRƯỜNG ĐẠI HỌC THỦ DẦU MỘT</w:t>
+        <w:br/>
+        <w:t>VIỆN CÔNG NGHỆ SỐ</w:t>
+      </w:r>
+    </w:p>
+    <w:p>
+      <w:pPr>
+        <w:spacing w:after="800"/>
+        <w:jc w:val="center"/>
+      </w:pPr>
+      <w:r>
+        <w:rPr>
+          <w:sz w:val="24"/>
+        </w:rPr>
+        <w:t>-------------------***-------------------</w:t>
+      </w:r>
+    </w:p>
+    <w:p>
+      <w:pPr>
+        <w:spacing w:after="300"/>
+        <w:jc w:val="center"/>
+      </w:pPr>
+      <w:r>
+        <w:rPr>
+          <w:b/>
+          <w:sz w:val="30"/>
+        </w:rPr>
+        <w:t>ĐỒ ÁN CƠ SỞ NGÀNH</w:t>
+        <w:br/>
+        <w:t>NGÀNH: CÔNG NGHỆ THÔNG TIN</w:t>
+      </w:r>
+    </w:p>
+    <w:p>
+      <w:pPr>
+        <w:spacing w:after="1000" w:line="312" w:lineRule="auto"/>
+        <w:jc w:val="center"/>
+      </w:pPr>
+      <w:r>
+        <w:rPr>
+          <w:b/>
+          <w:color w:val="002060"/>
+          <w:sz w:val="34"/>
+        </w:rPr>
+        <w:t>ĐỀ TÀI:</w:t>
+        <w:br/>
+        <w:br/>
+        <w:t>XÂY DỰNG WEBSITE TRUYỀN THÔNG CÔNG ĐOÀN TDMU</w:t>
+        <w:br/>
+        <w:t>TÍCH HỢP AI HỖ TRỢ TẠO VÀ ĐĂNG TẢI NỘI DUNG</w:t>
+      </w:r>
+    </w:p>
+    <w:p>
+      <w:pPr>
+        <w:spacing w:after="120" w:line="312" w:lineRule="auto"/>
+        <w:ind w:left="1984"/>
+        <w:jc w:val="left"/>
+      </w:pPr>
+      <w:r>
+        <w:rPr>
+          <w:b/>
+          <w:sz w:val="26"/>
+        </w:rPr>
+        <w:t>GIẢNG VIÊN HƯỚNG DẪN:  ThS. Võ Quốc Lương</w:t>
+        <w:br/>
+        <w:br/>
+        <w:t>SINH VIÊN THỰC HIỆN:    Nhóm 2</w:t>
+        <w:br/>
+        <w:t>1. Nguyễn Bình Dương  -  MSSV: 2424802010319  -  Lớp: D24CNTT05 (Trưởng nhóm)</w:t>
+        <w:br/>
+        <w:t>2. Trần Hồng Thanh    -  MSSV: 2424802010439  -  Lớp: D24CNTT03</w:t>
+        <w:br/>
+        <w:t>3. Phạm Anh Tuấn      -  MSSV: 2324802010393  -  Lớp: D23CNTT03</w:t>
+      </w:r>
+    </w:p>
+    <w:p>
+      <w:pPr>
+        <w:spacing w:before="1600"/>
+        <w:jc w:val="center"/>
+      </w:pPr>
+      <w:r>
+        <w:rPr>
+          <w:b/>
+          <w:sz w:val="26"/>
+        </w:rPr>
+        <w:t>BÌNH DƯƠNG, THÁNG 10/2026</w:t>
       </w:r>
     </w:p>
     <w:p>
@@ -204,6 +234,23 @@
     </w:p>
     <w:p>
       <w:pPr>
+        <w:jc w:val="left"/>
+      </w:pPr>
+      <w:r>
+        <w:rPr>
+          <w:b/>
+          <w:sz w:val="22"/>
+        </w:rPr>
+        <w:t>TRƯỜNG ĐẠI HỌC THỦ DẦU MỘT</w:t>
+        <w:br/>
+        <w:t>VIỆN: CÔNG NGHỆ SỐ</w:t>
+        <w:br/>
+        <w:t>CTĐT: CÔNG NGHỆ THÔNG TIN</w:t>
+      </w:r>
+    </w:p>
+    <w:p>
+      <w:pPr>
+        <w:spacing w:before="120" w:after="80"/>
         <w:jc w:val="center"/>
       </w:pPr>
       <w:r>
@@ -211,15 +258,9 @@
           <w:b/>
           <w:sz w:val="26"/>
         </w:rPr>
-        <w:t>VIỆN: CÔNG NGHỆ SỐ</w:t>
+        <w:t>PHIẾU ĐÁNH GIÁ KIỂM TRA HỌC PHẦN: ĐỒ ÁN CƠ SỞ NGÀNH</w:t>
         <w:br/>
-        <w:t>CTĐT: CÔNG NGHỆ THÔNG TIN</w:t>
-        <w:br/>
-        <w:br/>
-        <w:t>PHIẾU ĐÁNH GIÁ KIỂM TRA</w:t>
-        <w:br/>
-        <w:t>HỌC PHẦN: ĐỒ ÁN CƠ SỞ NGÀNH</w:t>
-        <w:br/>
+        <w:t>Học kỳ: 1  -  Năm học: 2026-2027  -  Khóa: 2024-2028</w:t>
       </w:r>
     </w:p>
     <w:p>
@@ -230,25 +271,75 @@
       <w:r>
         <w:rPr>
           <w:rFonts w:ascii="Times New Roman" w:hAnsi="Times New Roman"/>
+          <w:b/>
+          <w:i w:val="0"/>
+          <w:sz w:val="26"/>
+        </w:rPr>
+        <w:t>I. THÔNG TIN CHUNG HỌC PHẦN</w:t>
+      </w:r>
+    </w:p>
+    <w:p>
+      <w:pPr>
+        <w:spacing w:before="0" w:after="120" w:line="312" w:lineRule="auto"/>
+        <w:ind w:firstLine="720"/>
+        <w:jc w:val="both"/>
+      </w:pPr>
+      <w:r>
+        <w:rPr>
+          <w:rFonts w:ascii="Times New Roman" w:hAnsi="Times New Roman"/>
           <w:b w:val="0"/>
           <w:i w:val="0"/>
           <w:sz w:val="26"/>
         </w:rPr>
-        <w:t>Học kỳ: 1     Năm học: 2026-2027     Khóa: 2024-2028</w:t>
+        <w:t>- Tên học phần: Đồ án cơ sở ngành</w:t>
       </w:r>
     </w:p>
     <w:p>
       <w:pPr>
-        <w:spacing w:before="160" w:after="80" w:line="312" w:lineRule="auto"/>
-        <w:ind w:firstLine="0"/>
+        <w:spacing w:before="0" w:after="120" w:line="312" w:lineRule="auto"/>
+        <w:ind w:firstLine="720"/>
+        <w:jc w:val="both"/>
       </w:pPr>
       <w:r>
         <w:rPr>
           <w:rFonts w:ascii="Times New Roman" w:hAnsi="Times New Roman"/>
-          <w:b/>
+          <w:b w:val="0"/>
+          <w:i w:val="0"/>
           <w:sz w:val="26"/>
         </w:rPr>
-        <w:t>I. THÔNG TIN CHUNG HỌC PHẦN</w:t>
+        <w:t>- Mã học phần: CNTT044                       Số tín chỉ: 2</w:t>
+      </w:r>
+    </w:p>
+    <w:p>
+      <w:pPr>
+        <w:spacing w:before="0" w:after="120" w:line="312" w:lineRule="auto"/>
+        <w:ind w:firstLine="720"/>
+        <w:jc w:val="both"/>
+      </w:pPr>
+      <w:r>
+        <w:rPr>
+          <w:rFonts w:ascii="Times New Roman" w:hAnsi="Times New Roman"/>
+          <w:b w:val="0"/>
+          <w:i w:val="0"/>
+          <w:sz w:val="26"/>
+        </w:rPr>
+        <w:t>- Ngành đào tạo: Công nghệ thông tin</w:t>
+      </w:r>
+    </w:p>
+    <w:p>
+      <w:pPr>
+        <w:spacing w:before="0" w:after="120" w:line="312" w:lineRule="auto"/>
+        <w:ind w:firstLine="720"/>
+        <w:jc w:val="both"/>
+      </w:pPr>
+      <w:r>
+        <w:rPr>
+          <w:rFonts w:ascii="Times New Roman" w:hAnsi="Times New Roman"/>
+          <w:b w:val="0"/>
+          <w:i w:val="0"/>
+          <w:sz w:val="26"/>
+        </w:rPr>
+        <w:t>- Hình thức kiểm tra: Đồ án (Báo cáo và bảo vệ sản phẩm phần mềm)</w:t>
       </w:r>
     </w:p>
     <w:p>
@@ -259,28 +350,8 @@
       <w:r>
         <w:rPr>
           <w:rFonts w:ascii="Times New Roman" w:hAnsi="Times New Roman"/>
-          <w:b w:val="0"/>
+          <w:b/>
           <w:i w:val="0"/>
-          <w:sz w:val="26"/>
-        </w:rPr>
-        <w:t>- Tên học phần: Đồ án cơ sở ngành</w:t>
-        <w:br/>
-        <w:t>- Mã học phần: CNTT044                 Số tín chỉ: 2</w:t>
-        <w:br/>
-        <w:t>- Ngành đào tạo: Công nghệ thông tin</w:t>
-        <w:br/>
-        <w:t>- Hình thức kiểm tra: Đồ án</w:t>
-      </w:r>
-    </w:p>
-    <w:p>
-      <w:pPr>
-        <w:spacing w:before="160" w:after="80" w:line="312" w:lineRule="auto"/>
-        <w:ind w:firstLine="0"/>
-      </w:pPr>
-      <w:r>
-        <w:rPr>
-          <w:rFonts w:ascii="Times New Roman" w:hAnsi="Times New Roman"/>
-          <w:b/>
           <w:sz w:val="26"/>
         </w:rPr>
         <w:t>II. KẾT QUẢ ĐÁNH GIÁ</w:t>
@@ -289,16 +360,17 @@
     <w:p>
       <w:pPr>
         <w:spacing w:before="0" w:after="120" w:line="312" w:lineRule="auto"/>
+        <w:ind w:firstLine="720"/>
         <w:jc w:val="both"/>
       </w:pPr>
       <w:r>
         <w:rPr>
           <w:rFonts w:ascii="Times New Roman" w:hAnsi="Times New Roman"/>
-          <w:b w:val="0"/>
+          <w:b/>
           <w:i w:val="0"/>
           <w:sz w:val="26"/>
         </w:rPr>
-        <w:t>Danh sách sinh viên trong nhóm:</w:t>
+        <w:t>1. Danh sách sinh viên trong nhóm:</w:t>
       </w:r>
     </w:p>
     <w:tbl>
@@ -332,7 +404,7 @@
             <w:r>
               <w:rPr>
                 <w:b/>
-                <w:sz w:val="20"/>
+                <w:sz w:val="19"/>
               </w:rPr>
               <w:t>MSSV</w:t>
             </w:r>
@@ -353,7 +425,7 @@
             <w:r>
               <w:rPr>
                 <w:b/>
-                <w:sz w:val="20"/>
+                <w:sz w:val="19"/>
               </w:rPr>
               <w:t>Họ và tên</w:t>
             </w:r>
@@ -374,9 +446,9 @@
             <w:r>
               <w:rPr>
                 <w:b/>
-                <w:sz w:val="20"/>
+                <w:sz w:val="19"/>
               </w:rPr>
-              <w:t>Lớp</w:t>
+              <w:t>Đề tài</w:t>
             </w:r>
           </w:p>
         </w:tc>
@@ -395,9 +467,11 @@
             <w:r>
               <w:rPr>
                 <w:b/>
-                <w:sz w:val="20"/>
+                <w:sz w:val="19"/>
               </w:rPr>
-              <w:t>Ngành</w:t>
+              <w:t>Khảo sát</w:t>
+              <w:br/>
+              <w:t>(20%)</w:t>
             </w:r>
           </w:p>
         </w:tc>
@@ -416,9 +490,11 @@
             <w:r>
               <w:rPr>
                 <w:b/>
-                <w:sz w:val="20"/>
+                <w:sz w:val="19"/>
               </w:rPr>
-              <w:t>Phần 1 (Đóng góp %)</w:t>
+              <w:t>Phân tích</w:t>
+              <w:br/>
+              <w:t>(20%)</w:t>
             </w:r>
           </w:p>
         </w:tc>
@@ -437,9 +513,11 @@
             <w:r>
               <w:rPr>
                 <w:b/>
-                <w:sz w:val="20"/>
+                <w:sz w:val="19"/>
               </w:rPr>
-              <w:t>Phần 2 (Chủ đề)</w:t>
+              <w:t>Thiết kế</w:t>
+              <w:br/>
+              <w:t>(30%)</w:t>
             </w:r>
           </w:p>
         </w:tc>
@@ -458,9 +536,11 @@
             <w:r>
               <w:rPr>
                 <w:b/>
-                <w:sz w:val="20"/>
+                <w:sz w:val="19"/>
               </w:rPr>
-              <w:t>Điểm = P1*P2</w:t>
+              <w:t>Hiện thực</w:t>
+              <w:br/>
+              <w:t>(30%)</w:t>
             </w:r>
           </w:p>
         </w:tc>
@@ -479,7 +559,7 @@
           <w:p>
             <w:r>
               <w:rPr>
-                <w:sz w:val="20"/>
+                <w:sz w:val="18"/>
               </w:rPr>
               <w:t>2424802010319</w:t>
             </w:r>
@@ -498,7 +578,7 @@
           <w:p>
             <w:r>
               <w:rPr>
-                <w:sz w:val="20"/>
+                <w:sz w:val="18"/>
               </w:rPr>
               <w:t>Nguyễn Bình Dương</w:t>
             </w:r>
@@ -517,9 +597,9 @@
           <w:p>
             <w:r>
               <w:rPr>
-                <w:sz w:val="20"/>
+                <w:sz w:val="18"/>
               </w:rPr>
-              <w:t>D24CNTT05</w:t>
+              <w:t>Xây dựng website truyền thông Công đoàn TDMU tích hợp AI hỗ trợ tạo và đăng tải nội dung</w:t>
             </w:r>
           </w:p>
         </w:tc>
@@ -536,26 +616,7 @@
           <w:p>
             <w:r>
               <w:rPr>
-                <w:sz w:val="20"/>
-              </w:rPr>
-              <w:t>CNTT</w:t>
-            </w:r>
-          </w:p>
-        </w:tc>
-        <w:tc>
-          <w:tcPr>
-            <w:tcW w:type="dxa" w:w="1344"/>
-            <w:tcBorders>
-              <w:top w:val="single" w:sz="4" w:space="0" w:color="auto"/>
-              <w:left w:val="single" w:sz="4" w:space="0" w:color="auto"/>
-              <w:bottom w:val="single" w:sz="4" w:space="0" w:color="auto"/>
-              <w:right w:val="single" w:sz="4" w:space="0" w:color="auto"/>
-            </w:tcBorders>
-          </w:tcPr>
-          <w:p>
-            <w:r>
-              <w:rPr>
-                <w:sz w:val="20"/>
+                <w:sz w:val="18"/>
               </w:rPr>
             </w:r>
           </w:p>
@@ -573,7 +634,7 @@
           <w:p>
             <w:r>
               <w:rPr>
-                <w:sz w:val="20"/>
+                <w:sz w:val="18"/>
               </w:rPr>
             </w:r>
           </w:p>
@@ -591,7 +652,25 @@
           <w:p>
             <w:r>
               <w:rPr>
-                <w:sz w:val="20"/>
+                <w:sz w:val="18"/>
+              </w:rPr>
+            </w:r>
+          </w:p>
+        </w:tc>
+        <w:tc>
+          <w:tcPr>
+            <w:tcW w:type="dxa" w:w="1344"/>
+            <w:tcBorders>
+              <w:top w:val="single" w:sz="4" w:space="0" w:color="auto"/>
+              <w:left w:val="single" w:sz="4" w:space="0" w:color="auto"/>
+              <w:bottom w:val="single" w:sz="4" w:space="0" w:color="auto"/>
+              <w:right w:val="single" w:sz="4" w:space="0" w:color="auto"/>
+            </w:tcBorders>
+          </w:tcPr>
+          <w:p>
+            <w:r>
+              <w:rPr>
+                <w:sz w:val="18"/>
               </w:rPr>
             </w:r>
           </w:p>
@@ -611,7 +690,7 @@
           <w:p>
             <w:r>
               <w:rPr>
-                <w:sz w:val="20"/>
+                <w:sz w:val="18"/>
               </w:rPr>
               <w:t>2424802010439</w:t>
             </w:r>
@@ -630,7 +709,7 @@
           <w:p>
             <w:r>
               <w:rPr>
-                <w:sz w:val="20"/>
+                <w:sz w:val="18"/>
               </w:rPr>
               <w:t>Trần Hồng Thanh</w:t>
             </w:r>
@@ -649,9 +728,9 @@
           <w:p>
             <w:r>
               <w:rPr>
-                <w:sz w:val="20"/>
+                <w:sz w:val="18"/>
               </w:rPr>
-              <w:t>D24CNTT03</w:t>
+              <w:t>Xây dựng website truyền thông Công đoàn TDMU tích hợp AI hỗ trợ tạo và đăng tải nội dung</w:t>
             </w:r>
           </w:p>
         </w:tc>
@@ -668,26 +747,7 @@
           <w:p>
             <w:r>
               <w:rPr>
-                <w:sz w:val="20"/>
-              </w:rPr>
-              <w:t>CNTT</w:t>
-            </w:r>
-          </w:p>
-        </w:tc>
-        <w:tc>
-          <w:tcPr>
-            <w:tcW w:type="dxa" w:w="1344"/>
-            <w:tcBorders>
-              <w:top w:val="single" w:sz="4" w:space="0" w:color="auto"/>
-              <w:left w:val="single" w:sz="4" w:space="0" w:color="auto"/>
-              <w:bottom w:val="single" w:sz="4" w:space="0" w:color="auto"/>
-              <w:right w:val="single" w:sz="4" w:space="0" w:color="auto"/>
-            </w:tcBorders>
-          </w:tcPr>
-          <w:p>
-            <w:r>
-              <w:rPr>
-                <w:sz w:val="20"/>
+                <w:sz w:val="18"/>
               </w:rPr>
             </w:r>
           </w:p>
@@ -705,7 +765,7 @@
           <w:p>
             <w:r>
               <w:rPr>
-                <w:sz w:val="20"/>
+                <w:sz w:val="18"/>
               </w:rPr>
             </w:r>
           </w:p>
@@ -723,7 +783,25 @@
           <w:p>
             <w:r>
               <w:rPr>
-                <w:sz w:val="20"/>
+                <w:sz w:val="18"/>
+              </w:rPr>
+            </w:r>
+          </w:p>
+        </w:tc>
+        <w:tc>
+          <w:tcPr>
+            <w:tcW w:type="dxa" w:w="1344"/>
+            <w:tcBorders>
+              <w:top w:val="single" w:sz="4" w:space="0" w:color="auto"/>
+              <w:left w:val="single" w:sz="4" w:space="0" w:color="auto"/>
+              <w:bottom w:val="single" w:sz="4" w:space="0" w:color="auto"/>
+              <w:right w:val="single" w:sz="4" w:space="0" w:color="auto"/>
+            </w:tcBorders>
+          </w:tcPr>
+          <w:p>
+            <w:r>
+              <w:rPr>
+                <w:sz w:val="18"/>
               </w:rPr>
             </w:r>
           </w:p>
@@ -743,7 +821,7 @@
           <w:p>
             <w:r>
               <w:rPr>
-                <w:sz w:val="20"/>
+                <w:sz w:val="18"/>
               </w:rPr>
               <w:t>2324802010393</w:t>
             </w:r>
@@ -762,7 +840,7 @@
           <w:p>
             <w:r>
               <w:rPr>
-                <w:sz w:val="20"/>
+                <w:sz w:val="18"/>
               </w:rPr>
               <w:t>Phạm Anh Tuấn</w:t>
             </w:r>
@@ -781,9 +859,9 @@
           <w:p>
             <w:r>
               <w:rPr>
-                <w:sz w:val="20"/>
+                <w:sz w:val="18"/>
               </w:rPr>
-              <w:t>D23CNTT03</w:t>
+              <w:t>Xây dựng website truyền thông Công đoàn TDMU tích hợp AI hỗ trợ tạo và đăng tải nội dung</w:t>
             </w:r>
           </w:p>
         </w:tc>
@@ -800,26 +878,7 @@
           <w:p>
             <w:r>
               <w:rPr>
-                <w:sz w:val="20"/>
-              </w:rPr>
-              <w:t>CNTT</w:t>
-            </w:r>
-          </w:p>
-        </w:tc>
-        <w:tc>
-          <w:tcPr>
-            <w:tcW w:type="dxa" w:w="1344"/>
-            <w:tcBorders>
-              <w:top w:val="single" w:sz="4" w:space="0" w:color="auto"/>
-              <w:left w:val="single" w:sz="4" w:space="0" w:color="auto"/>
-              <w:bottom w:val="single" w:sz="4" w:space="0" w:color="auto"/>
-              <w:right w:val="single" w:sz="4" w:space="0" w:color="auto"/>
-            </w:tcBorders>
-          </w:tcPr>
-          <w:p>
-            <w:r>
-              <w:rPr>
-                <w:sz w:val="20"/>
+                <w:sz w:val="18"/>
               </w:rPr>
             </w:r>
           </w:p>
@@ -837,7 +896,7 @@
           <w:p>
             <w:r>
               <w:rPr>
-                <w:sz w:val="20"/>
+                <w:sz w:val="18"/>
               </w:rPr>
             </w:r>
           </w:p>
@@ -855,13 +914,49 @@
           <w:p>
             <w:r>
               <w:rPr>
-                <w:sz w:val="20"/>
+                <w:sz w:val="18"/>
+              </w:rPr>
+            </w:r>
+          </w:p>
+        </w:tc>
+        <w:tc>
+          <w:tcPr>
+            <w:tcW w:type="dxa" w:w="1344"/>
+            <w:tcBorders>
+              <w:top w:val="single" w:sz="4" w:space="0" w:color="auto"/>
+              <w:left w:val="single" w:sz="4" w:space="0" w:color="auto"/>
+              <w:bottom w:val="single" w:sz="4" w:space="0" w:color="auto"/>
+              <w:right w:val="single" w:sz="4" w:space="0" w:color="auto"/>
+            </w:tcBorders>
+          </w:tcPr>
+          <w:p>
+            <w:r>
+              <w:rPr>
+                <w:sz w:val="18"/>
               </w:rPr>
             </w:r>
           </w:p>
         </w:tc>
       </w:tr>
     </w:tbl>
+    <w:p>
+      <w:r>
+        <w:br w:type="page"/>
+      </w:r>
+    </w:p>
+    <w:p>
+      <w:pPr>
+        <w:jc w:val="left"/>
+      </w:pPr>
+      <w:r>
+        <w:rPr>
+          <w:i/>
+          <w:sz w:val="20"/>
+        </w:rPr>
+        <w:t>Đồ án cơ sở ngành                                                                                         Trang iii</w:t>
+        <w:br/>
+      </w:r>
+    </w:p>
     <w:p>
       <w:pPr>
         <w:spacing w:before="0" w:after="120" w:line="312" w:lineRule="auto"/>
@@ -870,12 +965,11 @@
       <w:r>
         <w:rPr>
           <w:rFonts w:ascii="Times New Roman" w:hAnsi="Times New Roman"/>
-          <w:b w:val="0"/>
+          <w:b/>
           <w:i w:val="0"/>
           <w:sz w:val="26"/>
         </w:rPr>
-        <w:br/>
-        <w:t>Phần 1 (Chỉ sử dụng đối với bài làm theo nhóm): Nội dung đánh giá tham gia trong nhóm của sinh viên được tính theo phần trăm (%) đóng góp; đây là phần đánh giá cho cột (5) - Dành cho sinh viên tự đánh giá:</w:t>
+        <w:t>Phần 1: Nội dung đánh giá đóng góp của từng thành viên trong nhóm; áp dụng chung cho tất cả các chủ đề; đây là phần đánh giá cho các cột (1), (2), (3), (4), (5):</w:t>
       </w:r>
     </w:p>
     <w:tbl>
@@ -909,7 +1003,7 @@
             <w:r>
               <w:rPr>
                 <w:b/>
-                <w:sz w:val="20"/>
+                <w:sz w:val="19"/>
               </w:rPr>
               <w:t>Họ và tên SV</w:t>
             </w:r>
@@ -930,9 +1024,11 @@
             <w:r>
               <w:rPr>
                 <w:b/>
-                <w:sz w:val="20"/>
+                <w:sz w:val="19"/>
               </w:rPr>
-              <w:t>Thái độ (20%)</w:t>
+              <w:t>Nội dung</w:t>
+              <w:br/>
+              <w:t>thực hiện</w:t>
             </w:r>
           </w:p>
         </w:tc>
@@ -951,9 +1047,11 @@
             <w:r>
               <w:rPr>
                 <w:b/>
-                <w:sz w:val="20"/>
+                <w:sz w:val="19"/>
               </w:rPr>
-              <w:t>Ý kiến (20%)</w:t>
+              <w:t>Thời gian</w:t>
+              <w:br/>
+              <w:t>(20%) (1)</w:t>
             </w:r>
           </w:p>
         </w:tc>
@@ -972,9 +1070,11 @@
             <w:r>
               <w:rPr>
                 <w:b/>
-                <w:sz w:val="20"/>
+                <w:sz w:val="19"/>
               </w:rPr>
-              <w:t>Thời gian (30%)</w:t>
+              <w:t>Khối lượng</w:t>
+              <w:br/>
+              <w:t>(20%) (2)</w:t>
             </w:r>
           </w:p>
         </w:tc>
@@ -993,9 +1093,11 @@
             <w:r>
               <w:rPr>
                 <w:b/>
-                <w:sz w:val="20"/>
+                <w:sz w:val="19"/>
               </w:rPr>
-              <w:t>Chất lượng (30%)</w:t>
+              <w:t>Chất lượng</w:t>
+              <w:br/>
+              <w:t>(30%) (3)</w:t>
             </w:r>
           </w:p>
         </w:tc>
@@ -1014,9 +1116,11 @@
             <w:r>
               <w:rPr>
                 <w:b/>
-                <w:sz w:val="20"/>
+                <w:sz w:val="19"/>
               </w:rPr>
-              <w:t>Tổng % (100%)</w:t>
+              <w:t>Thuyết trình</w:t>
+              <w:br/>
+              <w:t>(30%) (4)</w:t>
             </w:r>
           </w:p>
         </w:tc>
@@ -1035,9 +1139,11 @@
             <w:r>
               <w:rPr>
                 <w:b/>
-                <w:sz w:val="20"/>
+                <w:sz w:val="19"/>
               </w:rPr>
-              <w:t>Ký tên</w:t>
+              <w:t>Tổng điểm</w:t>
+              <w:br/>
+              <w:t>(100%) (5)</w:t>
             </w:r>
           </w:p>
         </w:tc>
@@ -1056,7 +1162,7 @@
           <w:p>
             <w:r>
               <w:rPr>
-                <w:sz w:val="20"/>
+                <w:sz w:val="18"/>
               </w:rPr>
               <w:t>Nguyễn Bình Dương</w:t>
             </w:r>
@@ -1075,9 +1181,9 @@
           <w:p>
             <w:r>
               <w:rPr>
-                <w:sz w:val="20"/>
+                <w:sz w:val="18"/>
               </w:rPr>
-              <w:t>20%</w:t>
+              <w:t>Khảo sát, Kiến trúc hệ thống, Module AI &amp; Scheduler, CSDL</w:t>
             </w:r>
           </w:p>
         </w:tc>
@@ -1094,9 +1200,8 @@
           <w:p>
             <w:r>
               <w:rPr>
-                <w:sz w:val="20"/>
+                <w:sz w:val="18"/>
               </w:rPr>
-              <w:t>20%</w:t>
             </w:r>
           </w:p>
         </w:tc>
@@ -1113,9 +1218,8 @@
           <w:p>
             <w:r>
               <w:rPr>
-                <w:sz w:val="20"/>
+                <w:sz w:val="18"/>
               </w:rPr>
-              <w:t>30%</w:t>
             </w:r>
           </w:p>
         </w:tc>
@@ -1132,9 +1236,8 @@
           <w:p>
             <w:r>
               <w:rPr>
-                <w:sz w:val="20"/>
+                <w:sz w:val="18"/>
               </w:rPr>
-              <w:t>30%</w:t>
             </w:r>
           </w:p>
         </w:tc>
@@ -1151,9 +1254,8 @@
           <w:p>
             <w:r>
               <w:rPr>
-                <w:sz w:val="20"/>
+                <w:sz w:val="18"/>
               </w:rPr>
-              <w:t>100%</w:t>
             </w:r>
           </w:p>
         </w:tc>
@@ -1170,7 +1272,7 @@
           <w:p>
             <w:r>
               <w:rPr>
-                <w:sz w:val="20"/>
+                <w:sz w:val="18"/>
               </w:rPr>
             </w:r>
           </w:p>
@@ -1190,7 +1292,7 @@
           <w:p>
             <w:r>
               <w:rPr>
-                <w:sz w:val="20"/>
+                <w:sz w:val="18"/>
               </w:rPr>
               <w:t>Trần Hồng Thanh</w:t>
             </w:r>
@@ -1209,9 +1311,9 @@
           <w:p>
             <w:r>
               <w:rPr>
-                <w:sz w:val="20"/>
+                <w:sz w:val="18"/>
               </w:rPr>
-              <w:t>20%</w:t>
+              <w:t>Khảo sát nhu cầu, Phỏng vấn, Phân tích yêu cầu, Giao diện Web</w:t>
             </w:r>
           </w:p>
         </w:tc>
@@ -1228,9 +1330,8 @@
           <w:p>
             <w:r>
               <w:rPr>
-                <w:sz w:val="20"/>
+                <w:sz w:val="18"/>
               </w:rPr>
-              <w:t>20%</w:t>
             </w:r>
           </w:p>
         </w:tc>
@@ -1247,9 +1348,8 @@
           <w:p>
             <w:r>
               <w:rPr>
-                <w:sz w:val="20"/>
+                <w:sz w:val="18"/>
               </w:rPr>
-              <w:t>30%</w:t>
             </w:r>
           </w:p>
         </w:tc>
@@ -1266,9 +1366,8 @@
           <w:p>
             <w:r>
               <w:rPr>
-                <w:sz w:val="20"/>
+                <w:sz w:val="18"/>
               </w:rPr>
-              <w:t>30%</w:t>
             </w:r>
           </w:p>
         </w:tc>
@@ -1285,9 +1384,8 @@
           <w:p>
             <w:r>
               <w:rPr>
-                <w:sz w:val="20"/>
+                <w:sz w:val="18"/>
               </w:rPr>
-              <w:t>100%</w:t>
             </w:r>
           </w:p>
         </w:tc>
@@ -1304,7 +1402,7 @@
           <w:p>
             <w:r>
               <w:rPr>
-                <w:sz w:val="20"/>
+                <w:sz w:val="18"/>
               </w:rPr>
             </w:r>
           </w:p>
@@ -1324,7 +1422,7 @@
           <w:p>
             <w:r>
               <w:rPr>
-                <w:sz w:val="20"/>
+                <w:sz w:val="18"/>
               </w:rPr>
               <w:t>Phạm Anh Tuấn</w:t>
             </w:r>
@@ -1343,9 +1441,9 @@
           <w:p>
             <w:r>
               <w:rPr>
-                <w:sz w:val="20"/>
+                <w:sz w:val="18"/>
               </w:rPr>
-              <w:t>20%</w:t>
+              <w:t>Khảo sát phần cứng, Module CMS, Facebook Graph API, Kiểm thử</w:t>
             </w:r>
           </w:p>
         </w:tc>
@@ -1362,9 +1460,8 @@
           <w:p>
             <w:r>
               <w:rPr>
-                <w:sz w:val="20"/>
+                <w:sz w:val="18"/>
               </w:rPr>
-              <w:t>20%</w:t>
             </w:r>
           </w:p>
         </w:tc>
@@ -1381,9 +1478,8 @@
           <w:p>
             <w:r>
               <w:rPr>
-                <w:sz w:val="20"/>
+                <w:sz w:val="18"/>
               </w:rPr>
-              <w:t>30%</w:t>
             </w:r>
           </w:p>
         </w:tc>
@@ -1400,9 +1496,8 @@
           <w:p>
             <w:r>
               <w:rPr>
-                <w:sz w:val="20"/>
+                <w:sz w:val="18"/>
               </w:rPr>
-              <w:t>30%</w:t>
             </w:r>
           </w:p>
         </w:tc>
@@ -1419,9 +1514,8 @@
           <w:p>
             <w:r>
               <w:rPr>
-                <w:sz w:val="20"/>
+                <w:sz w:val="18"/>
               </w:rPr>
-              <w:t>100%</w:t>
             </w:r>
           </w:p>
         </w:tc>
@@ -1438,7 +1532,7 @@
           <w:p>
             <w:r>
               <w:rPr>
-                <w:sz w:val="20"/>
+                <w:sz w:val="18"/>
               </w:rPr>
             </w:r>
           </w:p>
@@ -1446,21 +1540,15 @@
       </w:tr>
     </w:tbl>
     <w:p>
-      <w:r>
-        <w:br w:type="page"/>
-      </w:r>
-    </w:p>
-    <w:p>
       <w:pPr>
-        <w:jc w:val="left"/>
+        <w:spacing w:before="80"/>
       </w:pPr>
       <w:r>
         <w:rPr>
           <w:i/>
           <w:sz w:val="20"/>
         </w:rPr>
-        <w:t>Đồ án cơ sở ngành                                                                                         Trang iii</w:t>
-        <w:br/>
+        <w:t>* Ghi chú: Điểm số các cột (1), (2), (3), (4) tính theo thang điểm 10. Điểm tổng kết cột (5) = (1)*0.2 + (2)*0.2 + (3)*0.3 + (4)*0.3</w:t>
       </w:r>
     </w:p>
     <w:p>
@@ -1696,7 +1784,7 @@
               <w:rPr>
                 <w:sz w:val="19"/>
               </w:rPr>
-              <w:t>Xác định yêu cầu và giải pháp của bài toán</w:t>
+              <w:t>Xác định yêu cầu chức năng, phi chức năng và giải pháp bài toán</w:t>
             </w:r>
           </w:p>
         </w:tc>
@@ -1827,7 +1915,7 @@
               <w:rPr>
                 <w:sz w:val="19"/>
               </w:rPr>
-              <w:t>Thiết kế hệ thống hoặc thuật toán rõ ràng, logic</w:t>
+              <w:t>Thiết kế biểu đồ Use Case, CSDL quan hệ và kiến trúc logic rõ ràng</w:t>
             </w:r>
           </w:p>
         </w:tc>
@@ -1941,7 +2029,7 @@
               <w:rPr>
                 <w:sz w:val="19"/>
               </w:rPr>
-              <w:t>Sản phẩm</w:t>
+              <w:t>Sản phẩm phần mềm</w:t>
             </w:r>
           </w:p>
         </w:tc>
@@ -1960,7 +2048,7 @@
               <w:rPr>
                 <w:sz w:val="19"/>
               </w:rPr>
-              <w:t>Triển khai giao diện hoặc thuật toán chính xác</w:t>
+              <w:t>Triển khai hoàn chỉnh Website truyền thông tích hợp AI và Facebook API</w:t>
             </w:r>
           </w:p>
         </w:tc>
@@ -2091,7 +2179,7 @@
               <w:rPr>
                 <w:sz w:val="19"/>
               </w:rPr>
-              <w:t>Thực hiện thử nghiệm, kiểm thử sản phẩm/thuật toán</w:t>
+              <w:t>Thực hiện kiểm thử chức năng (Black-box) và bảo mật hệ thống</w:t>
             </w:r>
           </w:p>
         </w:tc>
@@ -2224,7 +2312,7 @@
               <w:rPr>
                 <w:sz w:val="19"/>
               </w:rPr>
-              <w:t>Đánh giá mức độ ứng dụng thực tế, sử dụng công nghệ mới</w:t>
+              <w:t>Mức độ ứng dụng thực tế tại Công đoàn TDMU, tiết kiệm thời gian</w:t>
             </w:r>
           </w:p>
         </w:tc>
@@ -2357,7 +2445,7 @@
               <w:rPr>
                 <w:sz w:val="19"/>
               </w:rPr>
-              <w:t>Trình bày đúng quy cách, có tài liệu tham khảo đầy đủ</w:t>
+              <w:t>Trình bày đúng quy cách học thuật, tài liệu tham khảo đầy đủ</w:t>
             </w:r>
           </w:p>
         </w:tc>
@@ -2490,7 +2578,7 @@
               <w:rPr>
                 <w:sz w:val="19"/>
               </w:rPr>
-              <w:t>Phong cách trình bày, giọng nói, tương tác và họp nhóm tích cực</w:t>
+              <w:t>Kỹ năng trình bày, demo sản phẩm trực quan, trả lời chất vấn tốt</w:t>
             </w:r>
           </w:p>
         </w:tc>
@@ -2572,20 +2660,15 @@
     </w:tbl>
     <w:p>
       <w:pPr>
-        <w:spacing w:before="0" w:after="120" w:line="312" w:lineRule="auto"/>
-        <w:jc w:val="both"/>
+        <w:spacing w:before="200"/>
+        <w:jc w:val="right"/>
       </w:pPr>
       <w:r>
         <w:rPr>
-          <w:rFonts w:ascii="Times New Roman" w:hAnsi="Times New Roman"/>
-          <w:b w:val="0"/>
           <w:i/>
-          <w:sz w:val="26"/>
+          <w:sz w:val="24"/>
         </w:rPr>
-        <w:br/>
-        <w:t>Điểm tổng cộng: 10.0 điểm.</w:t>
-        <w:br/>
-        <w:t>Thành phố Thủ Dầu Một, ngày ... tháng ... năm 2026</w:t>
+        <w:t>Bình Dương, ngày 15 tháng 10 năm 2026</w:t>
       </w:r>
     </w:p>
     <w:p>
@@ -2864,7 +2947,7 @@
               <w:rPr>
                 <w:sz w:val="20"/>
               </w:rPr>
-              <w:t>Khảo sát hiện trạng, Phân tích chức năng hệ thống, Backend API</w:t>
+              <w:t>Khảo sát hiện trạng, Phân tích yêu cầu hệ thống, Định hướng kiến trúc CMS &amp; AI</w:t>
             </w:r>
           </w:p>
         </w:tc>
@@ -2883,7 +2966,7 @@
               <w:rPr>
                 <w:sz w:val="20"/>
               </w:rPr>
-              <w:t>15/08 - 25/08/2026</w:t>
+              <w:t>15/10 - 25/10/2026</w:t>
             </w:r>
           </w:p>
         </w:tc>
@@ -2942,7 +3025,7 @@
               <w:rPr>
                 <w:sz w:val="20"/>
               </w:rPr>
-              <w:t>Khảo sát nhu cầu, Phỏng vấn, Phân tích yêu cầu người dùng</w:t>
+              <w:t>Lập kế hoạch khảo sát, Phỏng vấn Cán bộ truyền thông, Phân tích yêu cầu người dùng</w:t>
             </w:r>
           </w:p>
         </w:tc>
@@ -2961,7 +3044,7 @@
               <w:rPr>
                 <w:sz w:val="20"/>
               </w:rPr>
-              <w:t>15/08 - 25/08/2026</w:t>
+              <w:t>15/10 - 25/10/2026</w:t>
             </w:r>
           </w:p>
         </w:tc>
@@ -3020,7 +3103,7 @@
               <w:rPr>
                 <w:sz w:val="20"/>
               </w:rPr>
-              <w:t>Khảo sát phần cứng, Thu thập dữ liệu thực tế, Viết báo cáo</w:t>
+              <w:t>Khảo sát phần cứng, Thu thập dữ liệu nghiệp vụ, Phân tích yêu cầu quản lý, Viết báo cáo</w:t>
             </w:r>
           </w:p>
         </w:tc>
@@ -3039,7 +3122,7 @@
               <w:rPr>
                 <w:sz w:val="20"/>
               </w:rPr>
-              <w:t>15/08 - 25/08/2026</w:t>
+              <w:t>15/10 - 25/10/2026</w:t>
             </w:r>
           </w:p>
         </w:tc>
@@ -3175,7 +3258,7 @@
               <w:rPr>
                 <w:sz w:val="20"/>
               </w:rPr>
-              <w:t>Sơ đồ Use Case tổng quát, Sơ đồ hoạt động Activity Diagram</w:t>
+              <w:t>Thiết kế biểu đồ Use Case tổng quát, Activity Diagram, Sequence Diagram</w:t>
             </w:r>
           </w:p>
         </w:tc>
@@ -3194,7 +3277,7 @@
               <w:rPr>
                 <w:sz w:val="20"/>
               </w:rPr>
-              <w:t>26/08 - 05/09/2026</w:t>
+              <w:t>26/10 - 10/11/2026</w:t>
             </w:r>
           </w:p>
         </w:tc>
@@ -3253,7 +3336,7 @@
               <w:rPr>
                 <w:sz w:val="20"/>
               </w:rPr>
-              <w:t>Phân rã Use Case chi tiết, Thiết kế giao diện Figma</w:t>
+              <w:t>Đặc tả Use Case chi tiết, Thiết kế UI/UX trên Figma (Portal &amp; Admin)</w:t>
             </w:r>
           </w:p>
         </w:tc>
@@ -3272,7 +3355,7 @@
               <w:rPr>
                 <w:sz w:val="20"/>
               </w:rPr>
-              <w:t>26/08 - 05/09/2026</w:t>
+              <w:t>26/10 - 10/11/2026</w:t>
             </w:r>
           </w:p>
         </w:tc>
@@ -3331,7 +3414,7 @@
               <w:rPr>
                 <w:sz w:val="20"/>
               </w:rPr>
-              <w:t>Thiết kế CSDL SQL Server 2 tầng, Mô tả bảng dữ liệu</w:t>
+              <w:t>Thiết kế Cơ sở dữ liệu quan hệ MySQL chuẩn hóa (ERD và mô tả bảng)</w:t>
             </w:r>
           </w:p>
         </w:tc>
@@ -3350,7 +3433,7 @@
               <w:rPr>
                 <w:sz w:val="20"/>
               </w:rPr>
-              <w:t>26/08 - 05/09/2026</w:t>
+              <w:t>26/10 - 10/11/2026</w:t>
             </w:r>
           </w:p>
         </w:tc>
@@ -3486,7 +3569,7 @@
               <w:rPr>
                 <w:sz w:val="20"/>
               </w:rPr>
-              <w:t>Tích hợp AI Studio (Gemini/Groq/NLP TF-IDF), API Báo cáo 16 Tổ</w:t>
+              <w:t>Tích hợp Trợ lý AI (OpenAI/Gemini API) hỗ trợ tạo nội dung, Scheduler tự động xuất bản</w:t>
             </w:r>
           </w:p>
         </w:tc>
@@ -3505,7 +3588,7 @@
               <w:rPr>
                 <w:sz w:val="20"/>
               </w:rPr>
-              <w:t>06/09 - 20/09/2026</w:t>
+              <w:t>11/11 - 10/12/2026</w:t>
             </w:r>
           </w:p>
         </w:tc>
@@ -3564,7 +3647,7 @@
               <w:rPr>
                 <w:sz w:val="20"/>
               </w:rPr>
-              <w:t>Xây dựng Frontend Cổng thông tin 9:3, Form nộp báo cáo 24 chỉ tiêu</w:t>
+              <w:t>Xây dựng giao diện Portal Responsive, Module tương tác bài viết (Like, Bình luận, Chia sẻ)</w:t>
             </w:r>
           </w:p>
         </w:tc>
@@ -3583,7 +3666,7 @@
               <w:rPr>
                 <w:sz w:val="20"/>
               </w:rPr>
-              <w:t>06/09 - 20/09/2026</w:t>
+              <w:t>11/11 - 10/12/2026</w:t>
             </w:r>
           </w:p>
         </w:tc>
@@ -3642,7 +3725,7 @@
               <w:rPr>
                 <w:sz w:val="20"/>
               </w:rPr>
-              <w:t>Hiện thực phân hệ CMS, Kho văn bản, Biểu mẫu, Phúc lợi</w:t>
+              <w:t>Phát triển CMS quản trị nội dung, phân quyền RBAC, tích hợp Facebook Graph API</w:t>
             </w:r>
           </w:p>
         </w:tc>
@@ -3661,7 +3744,7 @@
               <w:rPr>
                 <w:sz w:val="20"/>
               </w:rPr>
-              <w:t>06/09 - 20/09/2026</w:t>
+              <w:t>11/11 - 10/12/2026</w:t>
             </w:r>
           </w:p>
         </w:tc>
@@ -3797,7 +3880,7 @@
               <w:rPr>
                 <w:sz w:val="20"/>
               </w:rPr>
-              <w:t>Kiểm thử hệ thống, Hoàn thiện báo cáo, Chuẩn bị slide bảo vệ</w:t>
+              <w:t>Kiểm thử hệ thống (Black-box), Triển khai thực nghiệm tại TDMU, Hoàn thiện báo cáo</w:t>
             </w:r>
           </w:p>
         </w:tc>
@@ -3816,7 +3899,7 @@
               <w:rPr>
                 <w:sz w:val="20"/>
               </w:rPr>
-              <w:t>21/09 - 30/09/2026</w:t>
+              <w:t>11/12 - 25/12/2026</w:t>
             </w:r>
           </w:p>
         </w:tc>
@@ -3857,430 +3940,276 @@
     </w:p>
     <w:p>
       <w:pPr>
-        <w:spacing w:line="288" w:lineRule="auto" w:after="40"/>
-      </w:pPr>
-      <w:r>
-        <w:rPr>
-          <w:sz w:val="24"/>
-        </w:rPr>
-        <w:t>BẢNG PHÂN CÔNG CÔNG VIỆC</w:t>
-      </w:r>
-      <w:r>
-        <w:rPr>
-          <w:color w:val="9CA3AF"/>
-          <w:sz w:val="20"/>
-        </w:rPr>
-        <w:t xml:space="preserve"> ................................ </w:t>
-      </w:r>
-      <w:r>
-        <w:rPr>
-          <w:b/>
-          <w:sz w:val="24"/>
-        </w:rPr>
-        <w:t>v</w:t>
-      </w:r>
-    </w:p>
-    <w:p>
-      <w:pPr>
-        <w:spacing w:line="288" w:lineRule="auto" w:after="40"/>
+        <w:spacing w:after="60" w:line="276" w:lineRule="auto"/>
+        <w:ind w:firstLine="0"/>
       </w:pPr>
       <w:r>
         <w:rPr>
           <w:b/>
           <w:sz w:val="24"/>
         </w:rPr>
-        <w:t>MỤC LỤC</w:t>
-      </w:r>
-      <w:r>
-        <w:rPr>
-          <w:color w:val="9CA3AF"/>
-          <w:sz w:val="20"/>
-        </w:rPr>
-        <w:t xml:space="preserve"> .................................................................. </w:t>
-      </w:r>
-      <w:r>
-        <w:rPr>
-          <w:b/>
-          <w:sz w:val="24"/>
-        </w:rPr>
-        <w:t>vi</w:t>
+        <w:t>BẢNG PHÂN CÔNG CÔNG VIỆC  . . . . . . . . . . . . . . . . . . . . . . v</w:t>
       </w:r>
     </w:p>
     <w:p>
       <w:pPr>
-        <w:spacing w:line="288" w:lineRule="auto" w:after="40"/>
-      </w:pPr>
-      <w:r>
-        <w:rPr>
-          <w:sz w:val="24"/>
-        </w:rPr>
-        <w:t>DANH MỤC HÌNH</w:t>
-      </w:r>
-      <w:r>
-        <w:rPr>
-          <w:color w:val="9CA3AF"/>
-          <w:sz w:val="20"/>
-        </w:rPr>
-        <w:t xml:space="preserve"> ...................................................... </w:t>
-      </w:r>
-      <w:r>
-        <w:rPr>
-          <w:b/>
-          <w:sz w:val="24"/>
-        </w:rPr>
-        <w:t>vii</w:t>
-      </w:r>
-    </w:p>
-    <w:p>
-      <w:pPr>
-        <w:spacing w:line="288" w:lineRule="auto" w:after="40"/>
-      </w:pPr>
-      <w:r>
-        <w:rPr>
-          <w:sz w:val="24"/>
-        </w:rPr>
-        <w:t>DANH MỤC BẢNG</w:t>
-      </w:r>
-      <w:r>
-        <w:rPr>
-          <w:color w:val="9CA3AF"/>
-          <w:sz w:val="20"/>
-        </w:rPr>
-        <w:t xml:space="preserve"> ...................................................... </w:t>
-      </w:r>
-      <w:r>
-        <w:rPr>
-          <w:b/>
-          <w:sz w:val="24"/>
-        </w:rPr>
-        <w:t>viii</w:t>
-      </w:r>
-    </w:p>
-    <w:p>
-      <w:pPr>
-        <w:spacing w:line="288" w:lineRule="auto" w:after="40"/>
+        <w:spacing w:after="60" w:line="276" w:lineRule="auto"/>
+        <w:ind w:firstLine="0"/>
       </w:pPr>
       <w:r>
         <w:rPr>
           <w:b/>
           <w:sz w:val="24"/>
         </w:rPr>
-        <w:t>MỞ ĐẦU</w:t>
-      </w:r>
-      <w:r>
-        <w:rPr>
-          <w:color w:val="9CA3AF"/>
-          <w:sz w:val="20"/>
-        </w:rPr>
-        <w:t xml:space="preserve"> .................................................................... </w:t>
-      </w:r>
-      <w:r>
-        <w:rPr>
-          <w:b/>
-          <w:sz w:val="24"/>
-        </w:rPr>
-        <w:t>ix</w:t>
+        <w:t>MỤC LỤC  . . . . . . . . . . . . . . . . . . . . . . . . . . . . . . vi</w:t>
       </w:r>
     </w:p>
     <w:p>
       <w:pPr>
-        <w:spacing w:line="288" w:lineRule="auto" w:after="40"/>
+        <w:spacing w:after="60" w:line="276" w:lineRule="auto"/>
+        <w:ind w:firstLine="0"/>
+      </w:pPr>
+      <w:r>
+        <w:rPr>
+          <w:sz w:val="24"/>
+        </w:rPr>
+        <w:t>DANH MỤC HÌNH  . . . . . . . . . . . . . . . . . . . . . . . . . . . viii</w:t>
+      </w:r>
+    </w:p>
+    <w:p>
+      <w:pPr>
+        <w:spacing w:after="60" w:line="276" w:lineRule="auto"/>
+        <w:ind w:firstLine="0"/>
+      </w:pPr>
+      <w:r>
+        <w:rPr>
+          <w:sz w:val="24"/>
+        </w:rPr>
+        <w:t>DANH MỤC BẢNG  . . . . . . . . . . . . . . . . . . . . . . . . . . . x</w:t>
+      </w:r>
+    </w:p>
+    <w:p>
+      <w:pPr>
+        <w:spacing w:after="60" w:line="276" w:lineRule="auto"/>
+        <w:ind w:firstLine="0"/>
       </w:pPr>
       <w:r>
         <w:rPr>
           <w:b/>
           <w:sz w:val="24"/>
         </w:rPr>
-        <w:t>CHƯƠNG 1. TỔNG QUAN</w:t>
+        <w:t>MỞ ĐẦU  . . . . . . . . . . . . . . . . . . . . . . . . . . . . . . . ix</w:t>
       </w:r>
+    </w:p>
+    <w:p>
+      <w:pPr>
+        <w:spacing w:after="60" w:line="276" w:lineRule="auto"/>
+        <w:ind w:firstLine="0"/>
+      </w:pPr>
       <w:r>
         <w:rPr>
-          <w:color w:val="9CA3AF"/>
-          <w:sz w:val="20"/>
+          <w:sz w:val="24"/>
         </w:rPr>
-        <w:t xml:space="preserve"> .......................................... </w:t>
+        <w:t>1. Lý do chọn đề tài  . . . . . . . . . . . . . . . . . . . . . . . . ix</w:t>
       </w:r>
+    </w:p>
+    <w:p>
+      <w:pPr>
+        <w:spacing w:after="60" w:line="276" w:lineRule="auto"/>
+        <w:ind w:firstLine="0"/>
+      </w:pPr>
+      <w:r>
+        <w:rPr>
+          <w:sz w:val="24"/>
+        </w:rPr>
+        <w:t>2. Mục tiêu đề tài  . . . . . . . . . . . . . . . . . . . . . . . . . x</w:t>
+      </w:r>
+    </w:p>
+    <w:p>
+      <w:pPr>
+        <w:spacing w:after="60" w:line="276" w:lineRule="auto"/>
+        <w:ind w:firstLine="0"/>
+      </w:pPr>
+      <w:r>
+        <w:rPr>
+          <w:sz w:val="24"/>
+        </w:rPr>
+        <w:t>3. Đối tượng và Phạm vi nghiên cứu  . . . . . . . . . . . . . . . . . x</w:t>
+      </w:r>
+    </w:p>
+    <w:p>
+      <w:pPr>
+        <w:spacing w:after="60" w:line="276" w:lineRule="auto"/>
+        <w:ind w:firstLine="0"/>
+      </w:pPr>
+      <w:r>
+        <w:rPr>
+          <w:sz w:val="24"/>
+        </w:rPr>
+        <w:t>4. Phương pháp nghiên cứu  . . . . . . . . . . . . . . . . . . . . . x</w:t>
+      </w:r>
+    </w:p>
+    <w:p>
+      <w:pPr>
+        <w:spacing w:after="60" w:line="276" w:lineRule="auto"/>
+        <w:ind w:firstLine="0"/>
+      </w:pPr>
       <w:r>
         <w:rPr>
           <w:b/>
           <w:sz w:val="24"/>
         </w:rPr>
-        <w:t>1</w:t>
+        <w:t>CHƯƠNG 1. TỔNG QUAN  . . . . . . . . . . . . . . . . . . . . . . . . 1</w:t>
       </w:r>
     </w:p>
     <w:p>
       <w:pPr>
-        <w:spacing w:line="288" w:lineRule="auto" w:after="40"/>
+        <w:spacing w:after="60" w:line="276" w:lineRule="auto"/>
+        <w:ind w:firstLine="0"/>
       </w:pPr>
       <w:r>
         <w:rPr>
           <w:sz w:val="24"/>
         </w:rPr>
-        <w:t xml:space="preserve">  1.1. Khảo sát hiện trạng</w:t>
-      </w:r>
-      <w:r>
-        <w:rPr>
-          <w:color w:val="9CA3AF"/>
-          <w:sz w:val="20"/>
-        </w:rPr>
-        <w:t xml:space="preserve"> ............................ </w:t>
-      </w:r>
-      <w:r>
-        <w:rPr>
-          <w:b/>
-          <w:sz w:val="24"/>
-        </w:rPr>
-        <w:t>1</w:t>
+        <w:t>1.1. Khảo sát hiện trạng công tác truyền thông tại Công đoàn TDMU  . 1</w:t>
       </w:r>
     </w:p>
     <w:p>
       <w:pPr>
-        <w:spacing w:line="288" w:lineRule="auto" w:after="40"/>
+        <w:spacing w:after="60" w:line="276" w:lineRule="auto"/>
+        <w:ind w:firstLine="0"/>
       </w:pPr>
       <w:r>
         <w:rPr>
           <w:sz w:val="24"/>
         </w:rPr>
-        <w:t xml:space="preserve">  1.2. Khảo sát phần cứng</w:t>
-      </w:r>
-      <w:r>
-        <w:rPr>
-          <w:color w:val="9CA3AF"/>
-          <w:sz w:val="20"/>
-        </w:rPr>
-        <w:t xml:space="preserve"> .............................. </w:t>
-      </w:r>
-      <w:r>
-        <w:rPr>
-          <w:b/>
-          <w:sz w:val="24"/>
-        </w:rPr>
-        <w:t>2</w:t>
+        <w:t>1.2. Khảo sát phần cứng và hạ tầng công nghệ  . . . . . . . . . . . . 2</w:t>
       </w:r>
     </w:p>
     <w:p>
       <w:pPr>
-        <w:spacing w:line="288" w:lineRule="auto" w:after="40"/>
+        <w:spacing w:after="60" w:line="276" w:lineRule="auto"/>
+        <w:ind w:firstLine="0"/>
       </w:pPr>
       <w:r>
         <w:rPr>
           <w:sz w:val="24"/>
         </w:rPr>
-        <w:t xml:space="preserve">  1.3. Khảo sát nhu cầu</w:t>
-      </w:r>
-      <w:r>
-        <w:rPr>
-          <w:color w:val="9CA3AF"/>
-          <w:sz w:val="20"/>
-        </w:rPr>
-        <w:t xml:space="preserve"> .................................. </w:t>
-      </w:r>
-      <w:r>
-        <w:rPr>
-          <w:b/>
-          <w:sz w:val="24"/>
-        </w:rPr>
-        <w:t>3</w:t>
+        <w:t>1.3. Khảo sát nhu cầu  . . . . . . . . . . . . . . . . . . . . . . . 3</w:t>
       </w:r>
     </w:p>
     <w:p>
       <w:pPr>
-        <w:spacing w:line="288" w:lineRule="auto" w:after="40"/>
+        <w:spacing w:after="60" w:line="276" w:lineRule="auto"/>
+        <w:ind w:firstLine="0"/>
       </w:pPr>
       <w:r>
         <w:rPr>
           <w:sz w:val="24"/>
         </w:rPr>
-        <w:t xml:space="preserve">    1.3.1. Kế hoạch khảo sát</w:t>
-      </w:r>
-      <w:r>
-        <w:rPr>
-          <w:color w:val="9CA3AF"/>
-          <w:sz w:val="20"/>
-        </w:rPr>
-        <w:t xml:space="preserve"> ........................ </w:t>
-      </w:r>
-      <w:r>
-        <w:rPr>
-          <w:b/>
-          <w:sz w:val="24"/>
-        </w:rPr>
-        <w:t>3</w:t>
+        <w:t xml:space="preserve">    1.3.1. Kế hoạch khảo sát  . . . . . . . . . . . . . . . . . . . . 3</w:t>
       </w:r>
     </w:p>
     <w:p>
       <w:pPr>
-        <w:spacing w:line="288" w:lineRule="auto" w:after="40"/>
+        <w:spacing w:after="60" w:line="276" w:lineRule="auto"/>
+        <w:ind w:firstLine="0"/>
       </w:pPr>
       <w:r>
         <w:rPr>
           <w:sz w:val="24"/>
         </w:rPr>
-        <w:t xml:space="preserve">    1.3.2. Phỏng vấn</w:t>
-      </w:r>
-      <w:r>
-        <w:rPr>
-          <w:color w:val="9CA3AF"/>
-          <w:sz w:val="20"/>
-        </w:rPr>
-        <w:t xml:space="preserve"> ........................................ </w:t>
-      </w:r>
-      <w:r>
-        <w:rPr>
-          <w:b/>
-          <w:sz w:val="24"/>
-        </w:rPr>
-        <w:t>4</w:t>
+        <w:t xml:space="preserve">    1.3.2. Phỏng vấn  . . . . . . . . . . . . . . . . . . . . . . . . 4</w:t>
       </w:r>
     </w:p>
     <w:p>
       <w:pPr>
-        <w:spacing w:line="288" w:lineRule="auto" w:after="40"/>
+        <w:spacing w:after="60" w:line="276" w:lineRule="auto"/>
+        <w:ind w:firstLine="0"/>
       </w:pPr>
       <w:r>
         <w:rPr>
           <w:sz w:val="24"/>
         </w:rPr>
-        <w:t xml:space="preserve">  1.4. Phân tích yêu cầu</w:t>
-      </w:r>
-      <w:r>
-        <w:rPr>
-          <w:color w:val="9CA3AF"/>
-          <w:sz w:val="20"/>
-        </w:rPr>
-        <w:t xml:space="preserve"> ................................ </w:t>
-      </w:r>
-      <w:r>
-        <w:rPr>
-          <w:b/>
-          <w:sz w:val="24"/>
-        </w:rPr>
-        <w:t>7</w:t>
+        <w:t>1.4. Phân tích yêu cầu  . . . . . . . . . . . . . . . . . . . . . . . 7</w:t>
       </w:r>
     </w:p>
     <w:p>
       <w:pPr>
-        <w:spacing w:line="288" w:lineRule="auto" w:after="40"/>
+        <w:spacing w:after="60" w:line="276" w:lineRule="auto"/>
+        <w:ind w:firstLine="0"/>
       </w:pPr>
       <w:r>
         <w:rPr>
           <w:sz w:val="24"/>
         </w:rPr>
-        <w:t xml:space="preserve">    1.4.1. Yêu cầu của người dùng</w:t>
-      </w:r>
-      <w:r>
-        <w:rPr>
-          <w:color w:val="9CA3AF"/>
-          <w:sz w:val="20"/>
-        </w:rPr>
-        <w:t xml:space="preserve"> .............. </w:t>
-      </w:r>
-      <w:r>
-        <w:rPr>
-          <w:b/>
-          <w:sz w:val="24"/>
-        </w:rPr>
-        <w:t>7</w:t>
+        <w:t xml:space="preserve">    1.4.1. Yêu cầu của người dùng  . . . . . . . . . . . . . . . . . 7</w:t>
       </w:r>
     </w:p>
     <w:p>
       <w:pPr>
-        <w:spacing w:line="288" w:lineRule="auto" w:after="40"/>
+        <w:spacing w:after="60" w:line="276" w:lineRule="auto"/>
+        <w:ind w:firstLine="0"/>
       </w:pPr>
       <w:r>
         <w:rPr>
           <w:sz w:val="24"/>
         </w:rPr>
-        <w:t xml:space="preserve">    1.4.2. Yêu cầu của quản lý</w:t>
-      </w:r>
-      <w:r>
-        <w:rPr>
-          <w:color w:val="9CA3AF"/>
-          <w:sz w:val="20"/>
-        </w:rPr>
-        <w:t xml:space="preserve"> .................... </w:t>
-      </w:r>
-      <w:r>
-        <w:rPr>
-          <w:b/>
-          <w:sz w:val="24"/>
-        </w:rPr>
-        <w:t>8</w:t>
+        <w:t xml:space="preserve">    1.4.2. Yêu cầu của quản lý  . . . . . . . . . . . . . . . . . . . 7</w:t>
       </w:r>
     </w:p>
     <w:p>
       <w:pPr>
-        <w:spacing w:line="288" w:lineRule="auto" w:after="40"/>
+        <w:spacing w:after="60" w:line="276" w:lineRule="auto"/>
+        <w:ind w:firstLine="0"/>
       </w:pPr>
       <w:r>
         <w:rPr>
           <w:sz w:val="24"/>
         </w:rPr>
-        <w:t xml:space="preserve">  1.5. Phân tích chức năng</w:t>
-      </w:r>
-      <w:r>
-        <w:rPr>
-          <w:color w:val="9CA3AF"/>
-          <w:sz w:val="20"/>
-        </w:rPr>
-        <w:t xml:space="preserve"> ............................ </w:t>
-      </w:r>
-      <w:r>
-        <w:rPr>
-          <w:b/>
-          <w:sz w:val="24"/>
-        </w:rPr>
-        <w:t>8</w:t>
+        <w:t>1.5. Phân tích chức năng  . . . . . . . . . . . . . . . . . . . . . . 8</w:t>
       </w:r>
     </w:p>
     <w:p>
       <w:pPr>
-        <w:spacing w:line="288" w:lineRule="auto" w:after="40"/>
+        <w:spacing w:after="60" w:line="276" w:lineRule="auto"/>
+        <w:ind w:firstLine="0"/>
       </w:pPr>
       <w:r>
         <w:rPr>
           <w:sz w:val="24"/>
         </w:rPr>
-        <w:t xml:space="preserve">    1.5.1. Chức năng người dùng</w:t>
-      </w:r>
-      <w:r>
-        <w:rPr>
-          <w:color w:val="9CA3AF"/>
-          <w:sz w:val="20"/>
-        </w:rPr>
-        <w:t xml:space="preserve"> .................. </w:t>
-      </w:r>
-      <w:r>
-        <w:rPr>
-          <w:b/>
-          <w:sz w:val="24"/>
-        </w:rPr>
-        <w:t>8</w:t>
+        <w:t xml:space="preserve">    1.5.1. Chức năng người dùng  . . . . . . . . . . . . . . . . . . 8</w:t>
       </w:r>
     </w:p>
     <w:p>
       <w:pPr>
-        <w:spacing w:line="288" w:lineRule="auto" w:after="40"/>
+        <w:spacing w:after="60" w:line="276" w:lineRule="auto"/>
+        <w:ind w:firstLine="0"/>
       </w:pPr>
       <w:r>
         <w:rPr>
           <w:sz w:val="24"/>
         </w:rPr>
-        <w:t xml:space="preserve">    1.5.2. Chức năng phía người quản trị</w:t>
+        <w:t xml:space="preserve">    1.5.2. Chức năng phía người quản trị  . . . . . . . . . . . . . . 9</w:t>
       </w:r>
+    </w:p>
+    <w:p>
+      <w:r>
+        <w:br w:type="page"/>
+      </w:r>
+    </w:p>
+    <w:p>
+      <w:pPr>
+        <w:jc w:val="left"/>
+      </w:pPr>
       <w:r>
         <w:rPr>
-          <w:color w:val="9CA3AF"/>
+          <w:i/>
           <w:sz w:val="20"/>
         </w:rPr>
-        <w:t xml:space="preserve"> .. </w:t>
-      </w:r>
-      <w:r>
-        <w:rPr>
-          <w:b/>
-          <w:sz w:val="24"/>
-        </w:rPr>
-        <w:t>9</w:t>
+        <w:t>Đồ án cơ sở ngành                                                                                         Trang viii</w:t>
+        <w:br/>
       </w:r>
     </w:p>
     <w:p>
@@ -4295,183 +4224,79 @@
           <w:b/>
           <w:sz w:val="28"/>
         </w:rPr>
-        <w:br/>
         <w:t>DANH MỤC BẢNG</w:t>
       </w:r>
     </w:p>
     <w:p>
       <w:pPr>
-        <w:spacing w:line="288" w:lineRule="auto" w:after="40"/>
+        <w:spacing w:after="60"/>
+        <w:ind w:firstLine="0"/>
       </w:pPr>
       <w:r>
         <w:rPr>
           <w:sz w:val="24"/>
         </w:rPr>
-        <w:t>Bảng 1.1: Khảo sát phần cứng và hạ tầng công nghệ</w:t>
-      </w:r>
-      <w:r>
-        <w:rPr>
-          <w:color w:val="9CA3AF"/>
-          <w:sz w:val="20"/>
-        </w:rPr>
-        <w:t xml:space="preserve"> .. </w:t>
-      </w:r>
-      <w:r>
-        <w:rPr>
-          <w:b/>
-          <w:sz w:val="24"/>
-        </w:rPr>
-        <w:t>2</w:t>
+        <w:t>Bảng 1.1: Khảo sát phần cứng và hạ tầng công nghệ  . . . . . . . . . 2</w:t>
       </w:r>
     </w:p>
     <w:p>
       <w:pPr>
-        <w:spacing w:line="288" w:lineRule="auto" w:after="40"/>
+        <w:spacing w:after="60"/>
+        <w:ind w:firstLine="0"/>
       </w:pPr>
       <w:r>
         <w:rPr>
           <w:sz w:val="24"/>
         </w:rPr>
-        <w:t>Bảng 1.2: Kế hoạch khảo sát nhu cầu</w:t>
-      </w:r>
-      <w:r>
-        <w:rPr>
-          <w:color w:val="9CA3AF"/>
-          <w:sz w:val="20"/>
-        </w:rPr>
-        <w:t xml:space="preserve"> .......... </w:t>
-      </w:r>
-      <w:r>
-        <w:rPr>
-          <w:b/>
-          <w:sz w:val="24"/>
-        </w:rPr>
-        <w:t>3</w:t>
+        <w:t>Bảng 1.2: Kế hoạch khảo sát nhu cầu truyền thông  . . . . . . . . . . 3</w:t>
       </w:r>
     </w:p>
     <w:p>
       <w:pPr>
-        <w:spacing w:line="288" w:lineRule="auto" w:after="40"/>
+        <w:spacing w:after="60"/>
+        <w:ind w:firstLine="0"/>
       </w:pPr>
       <w:r>
         <w:rPr>
           <w:sz w:val="24"/>
         </w:rPr>
-        <w:t>Bảng 1.3: Phiếu phỏng vấn cán bộ lãnh đạo Công đoàn TDMU</w:t>
-      </w:r>
-      <w:r>
-        <w:rPr>
-          <w:color w:val="9CA3AF"/>
-          <w:sz w:val="20"/>
-        </w:rPr>
-        <w:t xml:space="preserve"> .. </w:t>
-      </w:r>
-      <w:r>
-        <w:rPr>
-          <w:b/>
-          <w:sz w:val="24"/>
-        </w:rPr>
-        <w:t>4</w:t>
+        <w:t>Bảng 1.3: Phiếu phỏng vấn Cán bộ Quản lý Truyền thông Công đoàn TDMU  4</w:t>
       </w:r>
     </w:p>
     <w:p>
       <w:pPr>
-        <w:spacing w:line="288" w:lineRule="auto" w:after="40"/>
+        <w:spacing w:after="60"/>
+        <w:ind w:firstLine="0"/>
       </w:pPr>
       <w:r>
         <w:rPr>
           <w:sz w:val="24"/>
         </w:rPr>
-        <w:t>Bảng 1.4: Phiếu phỏng vấn cán bộ phụ trách phong trào và Tổ trưởng</w:t>
-      </w:r>
-      <w:r>
-        <w:rPr>
-          <w:color w:val="9CA3AF"/>
-          <w:sz w:val="20"/>
-        </w:rPr>
-        <w:t xml:space="preserve"> .. </w:t>
-      </w:r>
-      <w:r>
-        <w:rPr>
-          <w:b/>
-          <w:sz w:val="24"/>
-        </w:rPr>
-        <w:t>5</w:t>
+        <w:t>Bảng 1.4: Phiếu phỏng vấn Biên tập viên &amp; Cán bộ Truyền thông kiêm nhiệm  5</w:t>
       </w:r>
     </w:p>
     <w:p>
       <w:pPr>
-        <w:spacing w:line="288" w:lineRule="auto" w:after="40"/>
+        <w:spacing w:after="60"/>
+        <w:ind w:firstLine="0"/>
       </w:pPr>
       <w:r>
         <w:rPr>
           <w:sz w:val="24"/>
         </w:rPr>
-        <w:t>Bảng 1.5: Phiếu phỏng vấn đoàn viên cơ sở</w:t>
-      </w:r>
-      <w:r>
-        <w:rPr>
-          <w:color w:val="9CA3AF"/>
-          <w:sz w:val="20"/>
-        </w:rPr>
-        <w:t xml:space="preserve"> .. </w:t>
-      </w:r>
-      <w:r>
-        <w:rPr>
-          <w:b/>
-          <w:sz w:val="24"/>
-        </w:rPr>
-        <w:t>6</w:t>
+        <w:t>Bảng 1.6: Danh sách chức năng phía người dùng  . . . . . . . . . . . 8</w:t>
       </w:r>
     </w:p>
     <w:p>
       <w:pPr>
-        <w:spacing w:line="288" w:lineRule="auto" w:after="40"/>
+        <w:spacing w:after="60"/>
+        <w:ind w:firstLine="0"/>
       </w:pPr>
       <w:r>
         <w:rPr>
           <w:sz w:val="24"/>
         </w:rPr>
-        <w:t>Bảng 1.6: Danh sách chức năng phía người dùng</w:t>
-      </w:r>
-      <w:r>
-        <w:rPr>
-          <w:color w:val="9CA3AF"/>
-          <w:sz w:val="20"/>
-        </w:rPr>
-        <w:t xml:space="preserve"> .. </w:t>
-      </w:r>
-      <w:r>
-        <w:rPr>
-          <w:b/>
-          <w:sz w:val="24"/>
-        </w:rPr>
-        <w:t>8</w:t>
-      </w:r>
-    </w:p>
-    <w:p>
-      <w:pPr>
-        <w:spacing w:line="288" w:lineRule="auto" w:after="40"/>
-      </w:pPr>
-      <w:r>
-        <w:rPr>
-          <w:sz w:val="24"/>
-        </w:rPr>
-        <w:t>Bảng 1.7: Danh sách chức năng phía người quản trị</w:t>
-      </w:r>
-      <w:r>
-        <w:rPr>
-          <w:color w:val="9CA3AF"/>
-          <w:sz w:val="20"/>
-        </w:rPr>
-        <w:t xml:space="preserve"> .. </w:t>
-      </w:r>
-      <w:r>
-        <w:rPr>
-          <w:b/>
-          <w:sz w:val="24"/>
-        </w:rPr>
-        <w:t>9</w:t>
+        <w:t>Bảng 1.7: Danh sách chức năng phía người quản trị  . . . . . . . . . 9</w:t>
       </w:r>
     </w:p>
     <w:p>
@@ -4509,18 +4334,16 @@
     </w:p>
     <w:p>
       <w:pPr>
-        <w:spacing w:before="0" w:after="120" w:line="312" w:lineRule="auto"/>
-        <w:ind w:firstLine="720"/>
-        <w:jc w:val="both"/>
+        <w:spacing w:before="160" w:after="80" w:line="312" w:lineRule="auto"/>
+        <w:ind w:firstLine="0"/>
       </w:pPr>
       <w:r>
         <w:rPr>
           <w:rFonts w:ascii="Times New Roman" w:hAnsi="Times New Roman"/>
-          <w:b w:val="0"/>
-          <w:i w:val="0"/>
+          <w:b/>
           <w:sz w:val="26"/>
         </w:rPr>
-        <w:t>Ngày nay, cuộc cách mạng công nghiệp lần thứ tư cùng với tiến trình chuyển đổi số quốc gia đã và đang tác động sâu sắc đến mọi lĩnh vực của đời sống xã hội, đặc biệt là trong môi trường giáo dục đại học. Tại Trường Đại học Thủ Dầu Một (TDMU), tổ chức Công đoàn đóng vai trò vô cùng quan trọng trong việc đại diện, bảo vệ quyền lợi hợp pháp, chăm lo đời sống vật chất - tinh thần, đồng thời là cầu nối truyền thông truyền tải kịp thời các chủ trương, đường lối của Đảng, chính sách pháp luật của Nhà nước và phong trào thi đua đến toàn thể cán bộ, giảng viên, nhân viên và người lao động.</w:t>
+        <w:t>1. Lý do chọn đề tài (Tính cấp thiết)</w:t>
       </w:r>
     </w:p>
     <w:p>
@@ -4536,7 +4359,7 @@
           <w:i w:val="0"/>
           <w:sz w:val="26"/>
         </w:rPr>
-        <w:t>Hiện nay, Công đoàn Trường Đại học Thủ Dầu Một đang trực tiếp quản lý và chỉ đạo hoạt động của 16 Tổ Công đoàn trực thuộc thuộc nhiều khối chức năng (khối phòng ban, viện nghiên cứu, trường trực thuộc và các khoa đào tạo). Định kỳ hàng tháng, công tác thu thập số liệu đánh giá thi đua 16 Tổ Công đoàn là một nhiệm vụ rất quan trọng nhưng đang gặp nhiều khó khăn do quy trình nộp biểu mẫu qua Google Forms còn phân tán, thiếu tính tổng hợp tức thời và cán bộ phải cộng dồn, xử lý bảng tính thủ công rất mất thời gian. Mặt khác, các cán bộ phụ trách công đoàn đều hoạt động theo chế độ kiêm nhiệm, việc vừa thực hiện nhiệm vụ chuyên môn giảng dạy, vừa tự biên soạn tin tức truyền thông, tóm tắt sự kiện đòi hỏi rất nhiều công sức.</w:t>
+        <w:t>Trong bối cảnh kỷ nguyên số và chiến lược chuyển đổi số quốc gia đang diễn ra mạnh mẽ, việc ứng dụng Công nghệ Thông tin vào công tác quản lý và truyền thông tại các tổ chức giáo dục đại học đã trở thành nhu cầu tất yếu. Tại Trường Đại học Thủ Dầu Một (TDMU), Công đoàn cơ sở giữ vị trí hạt nhân trong việc đại diện, chăm lo đời sống vật chất - tinh thần, bảo vệ quyền lợi hợp pháp cho toàn thể cán bộ, giảng viên, nhân viên và người lao động; đồng thời là cầu nối truyền tải nhanh chóng các chủ trương, đường lối của Đảng, chính sách pháp luật của Nhà nước và các phong trào thi đua dạy tốt - học tốt.</w:t>
       </w:r>
     </w:p>
     <w:p>
@@ -4552,7 +4375,449 @@
           <w:i w:val="0"/>
           <w:sz w:val="26"/>
         </w:rPr>
-        <w:t>Nhằm giải quyết triệt để những bất cập nêu trên và nâng cao hiệu quả chuyển đổi số trong hoạt động công đoàn, nhóm sinh viên đã nghiên cứu và lựa chọn đề tài: 'Xây dựng Cổng thông tin điện tử và Hệ thống Quản lý Báo cáo Thi đua Công đoàn Trường Đại học Thủ Dầu Một tích hợp Trợ lý Trí tuệ Nhân tạo' làm Đồ án cơ sở ngành. Hệ thống sau khi xây dựng sẽ chuẩn hóa toàn bộ kênh truyền thông chính thống theo nhận diện TDMU, số hóa trọn vẹn quy trình nộp báo cáo thi đua 16 Tổ với 24 chỉ tiêu số liệu và trang bị Trợ lý AI hỗ trợ tự động hóa soạn thảo, tóm tắt tin tức cho cán bộ.</w:t>
+        <w:t>Tuy nhiên, khảo sát thực tiễn công tác truyền thông của Công đoàn TDMU hiện nay cho thấy nhiều điểm nghẽn và thách thức lớn:</w:t>
+      </w:r>
+    </w:p>
+    <w:p>
+      <w:pPr>
+        <w:spacing w:before="0" w:after="120" w:line="312" w:lineRule="auto"/>
+        <w:ind w:firstLine="720"/>
+        <w:jc w:val="both"/>
+      </w:pPr>
+      <w:r>
+        <w:rPr>
+          <w:rFonts w:ascii="Times New Roman" w:hAnsi="Times New Roman"/>
+          <w:b w:val="0"/>
+          <w:i w:val="0"/>
+          <w:sz w:val="26"/>
+        </w:rPr>
+        <w:t>Thứ nhất, cán bộ phụ trách công tác Công đoàn hầu hết đều làm việc theo chế độ kiêm nhiệm với công tác chuyên môn (giảng dạy, nghiên cứu khoa học, quản lý phòng ban). Quỹ thời gian dành cho việc thu thập thông tin và sáng tạo nội dung truyền thông còn rất hạn chế, dễ dẫn đến việc cập nhật tin tức bị chậm trễ so với thời điểm diễn ra sự kiện.</w:t>
+      </w:r>
+    </w:p>
+    <w:p>
+      <w:pPr>
+        <w:spacing w:before="0" w:after="120" w:line="312" w:lineRule="auto"/>
+        <w:ind w:firstLine="720"/>
+        <w:jc w:val="both"/>
+      </w:pPr>
+      <w:r>
+        <w:rPr>
+          <w:rFonts w:ascii="Times New Roman" w:hAnsi="Times New Roman"/>
+          <w:b w:val="0"/>
+          <w:i w:val="0"/>
+          <w:sz w:val="26"/>
+        </w:rPr>
+        <w:t>Thứ hai, quy trình sáng tạo và biên tập bài viết đòi hỏi nhiều công sức: từ việc lên ý tưởng chủ đề, đặt tiêu đề thu hút người đọc, viết nội dung bài báo chuẩn mực theo phong cách đoàn thể, đến khâu chuẩn bị hình ảnh/video minh họa chất lượng cao. Điều này tạo áp lực lớn lên cán bộ kiêm nhiệm và khiến chất lượng nội dung giữa các đơn vị chưa thực sự đồng đều.</w:t>
+      </w:r>
+    </w:p>
+    <w:p>
+      <w:pPr>
+        <w:spacing w:before="0" w:after="120" w:line="312" w:lineRule="auto"/>
+        <w:ind w:firstLine="720"/>
+        <w:jc w:val="both"/>
+      </w:pPr>
+      <w:r>
+        <w:rPr>
+          <w:rFonts w:ascii="Times New Roman" w:hAnsi="Times New Roman"/>
+          <w:b w:val="0"/>
+          <w:i w:val="0"/>
+          <w:sz w:val="26"/>
+        </w:rPr>
+        <w:t>Thứ ba, quy trình đăng tải nội dung hiện còn mang tính thủ công và phân tán. Khi có bài viết mới, cán bộ phải đăng tải lặp lại trên Cổng tin tức, sau đó copy thủ công sang Fanpage Facebook chính thức của trường. Hệ thống hiện tại chưa có tính năng hẹn giờ xuất bản tự động vào các khung giờ vàng (buổi tối, cuối tuần) khi đoàn viên có tần suất trực tuyến cao nhất.</w:t>
+      </w:r>
+    </w:p>
+    <w:p>
+      <w:pPr>
+        <w:spacing w:before="0" w:after="120" w:line="312" w:lineRule="auto"/>
+        <w:ind w:firstLine="720"/>
+        <w:jc w:val="both"/>
+      </w:pPr>
+      <w:r>
+        <w:rPr>
+          <w:rFonts w:ascii="Times New Roman" w:hAnsi="Times New Roman"/>
+          <w:b w:val="0"/>
+          <w:i w:val="0"/>
+          <w:sz w:val="26"/>
+        </w:rPr>
+        <w:t>Thứ tư, thiếu hệ thống cơ sở dữ liệu lưu trữ tập trung và chưa có công cụ Dashboard trực quan đo lường, thống kê định lượng lượt xem (views), lượt tương tác (like, share, comment) đa kênh để đánh giá chính xác hiệu quả truyền thông.</w:t>
+      </w:r>
+    </w:p>
+    <w:p>
+      <w:pPr>
+        <w:spacing w:before="0" w:after="120" w:line="312" w:lineRule="auto"/>
+        <w:ind w:firstLine="720"/>
+        <w:jc w:val="both"/>
+      </w:pPr>
+      <w:r>
+        <w:rPr>
+          <w:rFonts w:ascii="Times New Roman" w:hAnsi="Times New Roman"/>
+          <w:b w:val="0"/>
+          <w:i w:val="0"/>
+          <w:sz w:val="26"/>
+        </w:rPr>
+        <w:t>Sự bùng nổ của Trí tuệ nhân tạo (AI) – đặc biệt là các mô hình ngôn ngữ lớn (LLMs như OpenAI GPT, Google Gemini) cùng các công cụ sinh ảnh/video tự động – đã mở ra giải pháp mang tính bước ngoặt. Việc ứng dụng AI vào hỗ trợ cán bộ sáng tạo nội dung, kết hợp hệ quản trị nội dung chuyên biệt trên nền tảng PHP Laravel Framework, CSDL MySQL và Facebook Graph API là hướng đi hoàn toàn đúng đắn, mang tính đột phá và khả thi cao.</w:t>
+      </w:r>
+    </w:p>
+    <w:p>
+      <w:pPr>
+        <w:spacing w:before="0" w:after="120" w:line="312" w:lineRule="auto"/>
+        <w:ind w:firstLine="720"/>
+        <w:jc w:val="both"/>
+      </w:pPr>
+      <w:r>
+        <w:rPr>
+          <w:rFonts w:ascii="Times New Roman" w:hAnsi="Times New Roman"/>
+          <w:b w:val="0"/>
+          <w:i w:val="0"/>
+          <w:sz w:val="26"/>
+        </w:rPr>
+        <w:t>Xuất phát từ thực tiễn trên, nhóm quyết định lựa chọn đề tài: "Xây dựng website truyền thông Công đoàn TDMU tích hợp AI hỗ trợ tạo và đăng tải nội dung" làm Đồ án cơ sở ngành.</w:t>
+      </w:r>
+    </w:p>
+    <w:p>
+      <w:pPr>
+        <w:spacing w:before="160" w:after="80" w:line="312" w:lineRule="auto"/>
+        <w:ind w:firstLine="0"/>
+      </w:pPr>
+      <w:r>
+        <w:rPr>
+          <w:rFonts w:ascii="Times New Roman" w:hAnsi="Times New Roman"/>
+          <w:b/>
+          <w:sz w:val="26"/>
+        </w:rPr>
+        <w:t>2. Mục tiêu của đề tài</w:t>
+      </w:r>
+    </w:p>
+    <w:p>
+      <w:pPr>
+        <w:spacing w:before="0" w:after="120" w:line="312" w:lineRule="auto"/>
+        <w:ind w:firstLine="720"/>
+        <w:jc w:val="both"/>
+      </w:pPr>
+      <w:r>
+        <w:rPr>
+          <w:rFonts w:ascii="Times New Roman" w:hAnsi="Times New Roman"/>
+          <w:b w:val="0"/>
+          <w:i w:val="0"/>
+          <w:sz w:val="26"/>
+        </w:rPr>
+        <w:t>• Mục tiêu chung: Xây dựng hoàn chỉnh hệ thống Website truyền thông chuyên nghiệp cho Công đoàn Trường Đại học Thủ Dầu Một, tích hợp Trợ lý Trí tuệ nhân tạo (AI) hỗ trợ sáng tạo nội dung, hình ảnh, video và tự động hóa quy trình xuất bản đa kênh (Website và Fanpage Facebook).</w:t>
+      </w:r>
+    </w:p>
+    <w:p>
+      <w:pPr>
+        <w:spacing w:before="0" w:after="120" w:line="312" w:lineRule="auto"/>
+        <w:ind w:firstLine="720"/>
+        <w:jc w:val="both"/>
+      </w:pPr>
+      <w:r>
+        <w:rPr>
+          <w:rFonts w:ascii="Times New Roman" w:hAnsi="Times New Roman"/>
+          <w:b w:val="0"/>
+          <w:i w:val="0"/>
+          <w:sz w:val="26"/>
+        </w:rPr>
+        <w:t>• Mục tiêu cụ thể:</w:t>
+      </w:r>
+    </w:p>
+    <w:p>
+      <w:pPr>
+        <w:spacing w:before="0" w:after="120" w:line="312" w:lineRule="auto"/>
+        <w:ind w:firstLine="720"/>
+        <w:jc w:val="both"/>
+      </w:pPr>
+      <w:r>
+        <w:rPr>
+          <w:rFonts w:ascii="Times New Roman" w:hAnsi="Times New Roman"/>
+          <w:b w:val="0"/>
+          <w:i w:val="0"/>
+          <w:sz w:val="26"/>
+        </w:rPr>
+        <w:t>1. Quản lý nội dung truyền thông: Xây dựng hệ quản trị nội dung (CMS) hiện đại, quản lý tin tức, thông báo, sự kiện theo chuyên mục chuyên nghiệp; phân quyền 3 cấp (Admin, Editor, Contributor) với quy trình duyệt bài 4 trạng thái khép kín (Soạn thảo -&gt; Gửi duyệt -&gt; Phê duyệt -&gt; Xuất bản / Hẹn giờ).</w:t>
+      </w:r>
+    </w:p>
+    <w:p>
+      <w:pPr>
+        <w:spacing w:before="0" w:after="120" w:line="312" w:lineRule="auto"/>
+        <w:ind w:firstLine="720"/>
+        <w:jc w:val="both"/>
+      </w:pPr>
+      <w:r>
+        <w:rPr>
+          <w:rFonts w:ascii="Times New Roman" w:hAnsi="Times New Roman"/>
+          <w:b w:val="0"/>
+          <w:i w:val="0"/>
+          <w:sz w:val="26"/>
+        </w:rPr>
+        <w:t>2. Tạo và biên tập bài viết: Cung cấp trình soạn thảo văn bản phong phú (Rich Text WYSIWYG) hỗ trợ định dạng trực quan, chèn media, tài liệu đính kèm và kiểm soát phiên bản bài viết.</w:t>
+      </w:r>
+    </w:p>
+    <w:p>
+      <w:pPr>
+        <w:spacing w:before="0" w:after="120" w:line="312" w:lineRule="auto"/>
+        <w:ind w:firstLine="720"/>
+        <w:jc w:val="both"/>
+      </w:pPr>
+      <w:r>
+        <w:rPr>
+          <w:rFonts w:ascii="Times New Roman" w:hAnsi="Times New Roman"/>
+          <w:b w:val="0"/>
+          <w:i w:val="0"/>
+          <w:sz w:val="26"/>
+        </w:rPr>
+        <w:t>3. Tích hợp AI hỗ trợ tạo nội dung, hình ảnh và video: Ứng dụng API AI tiên tiến (OpenAI / Gemini) để tự động sinh bản thảo bài viết từ từ khóa, gợi ý tiêu đề thu hút chuẩn báo chí đoàn thể, tóm tắt tin tức tự động và hỗ trợ gợi ý prompt hình ảnh banner và kịch bản video ngắn minh họa sự kiện.</w:t>
+      </w:r>
+    </w:p>
+    <w:p>
+      <w:pPr>
+        <w:spacing w:before="0" w:after="120" w:line="312" w:lineRule="auto"/>
+        <w:ind w:firstLine="720"/>
+        <w:jc w:val="both"/>
+      </w:pPr>
+      <w:r>
+        <w:rPr>
+          <w:rFonts w:ascii="Times New Roman" w:hAnsi="Times New Roman"/>
+          <w:b w:val="0"/>
+          <w:i w:val="0"/>
+          <w:sz w:val="26"/>
+        </w:rPr>
+        <w:t>4. Quản lý lịch đăng (Scheduler &amp; Cronjob): Xây dựng tính năng hẹn giờ xuất bản bài viết tự động theo khung ngày giờ thiết lập trước, giúp tối ưu hóa thời điểm tiếp cận bạn đọc.</w:t>
+      </w:r>
+    </w:p>
+    <w:p>
+      <w:pPr>
+        <w:spacing w:before="0" w:after="120" w:line="312" w:lineRule="auto"/>
+        <w:ind w:firstLine="720"/>
+        <w:jc w:val="both"/>
+      </w:pPr>
+      <w:r>
+        <w:rPr>
+          <w:rFonts w:ascii="Times New Roman" w:hAnsi="Times New Roman"/>
+          <w:b w:val="0"/>
+          <w:i w:val="0"/>
+          <w:sz w:val="26"/>
+        </w:rPr>
+        <w:t>5. Hỗ trợ đăng tải nội dung lên Website và Fanpage: Tích hợp Facebook Graph API để xuất bản đồng thời nội dung, hình ảnh và đường liên kết từ Website sang Fanpage Facebook Công đoàn TDMU chỉ với một thao tác duy nhất.</w:t>
+      </w:r>
+    </w:p>
+    <w:p>
+      <w:pPr>
+        <w:spacing w:before="0" w:after="120" w:line="312" w:lineRule="auto"/>
+        <w:ind w:firstLine="720"/>
+        <w:jc w:val="both"/>
+      </w:pPr>
+      <w:r>
+        <w:rPr>
+          <w:rFonts w:ascii="Times New Roman" w:hAnsi="Times New Roman"/>
+          <w:b w:val="0"/>
+          <w:i w:val="0"/>
+          <w:sz w:val="26"/>
+        </w:rPr>
+        <w:t>6. Theo dõi và thống kê hiệu quả truyền thông: Thiết kế Dashboard phân tích trực quan số lượt xem, lượt tương tác (like, comment, share) theo thời gian thực; xếp hạng top bài viết thu hút phục vụ công tác báo cáo của Ban Chấp hành.</w:t>
+      </w:r>
+    </w:p>
+    <w:p>
+      <w:pPr>
+        <w:spacing w:before="160" w:after="80" w:line="312" w:lineRule="auto"/>
+        <w:ind w:firstLine="0"/>
+      </w:pPr>
+      <w:r>
+        <w:rPr>
+          <w:rFonts w:ascii="Times New Roman" w:hAnsi="Times New Roman"/>
+          <w:b/>
+          <w:sz w:val="26"/>
+        </w:rPr>
+        <w:t>3. Đối tượng và Phạm vi nghiên cứu</w:t>
+      </w:r>
+    </w:p>
+    <w:p>
+      <w:pPr>
+        <w:spacing w:before="0" w:after="120" w:line="312" w:lineRule="auto"/>
+        <w:ind w:firstLine="720"/>
+        <w:jc w:val="both"/>
+      </w:pPr>
+      <w:r>
+        <w:rPr>
+          <w:rFonts w:ascii="Times New Roman" w:hAnsi="Times New Roman"/>
+          <w:b w:val="0"/>
+          <w:i w:val="0"/>
+          <w:sz w:val="26"/>
+        </w:rPr>
+        <w:t>• Đối tượng nghiên cứu:</w:t>
+      </w:r>
+    </w:p>
+    <w:p>
+      <w:pPr>
+        <w:spacing w:before="0" w:after="120" w:line="312" w:lineRule="auto"/>
+        <w:ind w:firstLine="720"/>
+        <w:jc w:val="both"/>
+      </w:pPr>
+      <w:r>
+        <w:rPr>
+          <w:rFonts w:ascii="Times New Roman" w:hAnsi="Times New Roman"/>
+          <w:b w:val="0"/>
+          <w:i w:val="0"/>
+          <w:sz w:val="26"/>
+        </w:rPr>
+        <w:t>- Quy trình nghiệp vụ truyền thông, xuất bản tin tức và quản lý phong trào đoàn thể tại Công đoàn Trường Đại học Thủ Dầu Một.</w:t>
+      </w:r>
+    </w:p>
+    <w:p>
+      <w:pPr>
+        <w:spacing w:before="0" w:after="120" w:line="312" w:lineRule="auto"/>
+        <w:ind w:firstLine="720"/>
+        <w:jc w:val="both"/>
+      </w:pPr>
+      <w:r>
+        <w:rPr>
+          <w:rFonts w:ascii="Times New Roman" w:hAnsi="Times New Roman"/>
+          <w:b w:val="0"/>
+          <w:i w:val="0"/>
+          <w:sz w:val="26"/>
+        </w:rPr>
+        <w:t>- Nền tảng công nghệ: PHP Laravel Framework, Hệ quản trị CSDL quan hệ MySQL, Giao thức kết nối RESTful API, Facebook Graph API, Kỹ thuật Prompt Engineering tương tác với các mô hình AI ngôn ngữ lớn.</w:t>
+      </w:r>
+    </w:p>
+    <w:p>
+      <w:pPr>
+        <w:spacing w:before="0" w:after="120" w:line="312" w:lineRule="auto"/>
+        <w:ind w:firstLine="720"/>
+        <w:jc w:val="both"/>
+      </w:pPr>
+      <w:r>
+        <w:rPr>
+          <w:rFonts w:ascii="Times New Roman" w:hAnsi="Times New Roman"/>
+          <w:b w:val="0"/>
+          <w:i w:val="0"/>
+          <w:sz w:val="26"/>
+        </w:rPr>
+        <w:t>- Đối tượng thụ hưởng: Ban Chấp hành Công đoàn (kiểm duyệt, theo dõi báo cáo), Biên tập viên / Cán bộ truyền thông (soạn thảo, lên lịch đăng), Đoàn viên, cán bộ, giảng viên, nhân viên TDMU (tiếp nhận thông tin, tương tác).</w:t>
+      </w:r>
+    </w:p>
+    <w:p>
+      <w:pPr>
+        <w:spacing w:before="0" w:after="120" w:line="312" w:lineRule="auto"/>
+        <w:ind w:firstLine="720"/>
+        <w:jc w:val="both"/>
+      </w:pPr>
+      <w:r>
+        <w:rPr>
+          <w:rFonts w:ascii="Times New Roman" w:hAnsi="Times New Roman"/>
+          <w:b w:val="0"/>
+          <w:i w:val="0"/>
+          <w:sz w:val="26"/>
+        </w:rPr>
+        <w:t>• Phạm vi nghiên cứu:</w:t>
+      </w:r>
+    </w:p>
+    <w:p>
+      <w:pPr>
+        <w:spacing w:before="0" w:after="120" w:line="312" w:lineRule="auto"/>
+        <w:ind w:firstLine="720"/>
+        <w:jc w:val="both"/>
+      </w:pPr>
+      <w:r>
+        <w:rPr>
+          <w:rFonts w:ascii="Times New Roman" w:hAnsi="Times New Roman"/>
+          <w:b w:val="0"/>
+          <w:i w:val="0"/>
+          <w:sz w:val="26"/>
+        </w:rPr>
+        <w:t>- Không gian: Triển khai thử nghiệm tại Công đoàn Trường Đại học Thủ Dầu Một.</w:t>
+      </w:r>
+    </w:p>
+    <w:p>
+      <w:pPr>
+        <w:spacing w:before="0" w:after="120" w:line="312" w:lineRule="auto"/>
+        <w:ind w:firstLine="720"/>
+        <w:jc w:val="both"/>
+      </w:pPr>
+      <w:r>
+        <w:rPr>
+          <w:rFonts w:ascii="Times New Roman" w:hAnsi="Times New Roman"/>
+          <w:b w:val="0"/>
+          <w:i w:val="0"/>
+          <w:sz w:val="26"/>
+        </w:rPr>
+        <w:t>- Nội dung: Tập trung giải quyết 6 nhóm bài toán cốt lõi: Quản trị nội dung truyền thông; Tạo và biên tập bài viết; Tích hợp AI hỗ trợ tạo nội dung, ảnh và video; Quản lý lịch đăng tự động; Xuất bản đa nền tảng lên Web &amp; Fanpage; Đo lường và thống kê tương tác.</w:t>
+      </w:r>
+    </w:p>
+    <w:p>
+      <w:pPr>
+        <w:spacing w:before="160" w:after="80" w:line="312" w:lineRule="auto"/>
+        <w:ind w:firstLine="0"/>
+      </w:pPr>
+      <w:r>
+        <w:rPr>
+          <w:rFonts w:ascii="Times New Roman" w:hAnsi="Times New Roman"/>
+          <w:b/>
+          <w:sz w:val="26"/>
+        </w:rPr>
+        <w:t>4. Phương pháp nghiên cứu</w:t>
+      </w:r>
+    </w:p>
+    <w:p>
+      <w:pPr>
+        <w:spacing w:before="0" w:after="120" w:line="312" w:lineRule="auto"/>
+        <w:ind w:firstLine="720"/>
+        <w:jc w:val="both"/>
+      </w:pPr>
+      <w:r>
+        <w:rPr>
+          <w:rFonts w:ascii="Times New Roman" w:hAnsi="Times New Roman"/>
+          <w:b w:val="0"/>
+          <w:i w:val="0"/>
+          <w:sz w:val="26"/>
+        </w:rPr>
+        <w:t>Đề tài kết hợp chặt chẽ giữa nghiên cứu lý thuyết và phương pháp thực nghiệm công nghệ:</w:t>
+      </w:r>
+    </w:p>
+    <w:p>
+      <w:pPr>
+        <w:spacing w:before="0" w:after="120" w:line="312" w:lineRule="auto"/>
+        <w:ind w:firstLine="720"/>
+        <w:jc w:val="both"/>
+      </w:pPr>
+      <w:r>
+        <w:rPr>
+          <w:rFonts w:ascii="Times New Roman" w:hAnsi="Times New Roman"/>
+          <w:b w:val="0"/>
+          <w:i w:val="0"/>
+          <w:sz w:val="26"/>
+        </w:rPr>
+        <w:t>- Phương pháp khảo sát và phân tích: Khảo sát thực tế hiện trạng truyền thông tại trường; lập phiếu câu hỏi và phỏng vấn trực tiếp cán bộ quản lý và biên tập viên; phân tích yêu cầu người dùng và mô hình hóa chức năng hệ thống.</w:t>
+      </w:r>
+    </w:p>
+    <w:p>
+      <w:pPr>
+        <w:spacing w:before="0" w:after="120" w:line="312" w:lineRule="auto"/>
+        <w:ind w:firstLine="720"/>
+        <w:jc w:val="both"/>
+      </w:pPr>
+      <w:r>
+        <w:rPr>
+          <w:rFonts w:ascii="Times New Roman" w:hAnsi="Times New Roman"/>
+          <w:b w:val="0"/>
+          <w:i w:val="0"/>
+          <w:sz w:val="26"/>
+        </w:rPr>
+        <w:t>- Phương pháp nghiên cứu lý thuyết: Tìm hiểu kiến trúc MVC (Model-View-Controller) trong Laravel Framework; nghiên cứu chuẩn bảo mật OAuth 2.0 và Facebook Graph API; nghiên cứu kỹ thuật xử lý ngôn ngữ tự nhiên (NLP) và cơ chế sinh nội dung bằng LLM.</w:t>
+      </w:r>
+    </w:p>
+    <w:p>
+      <w:pPr>
+        <w:spacing w:before="0" w:after="120" w:line="312" w:lineRule="auto"/>
+        <w:ind w:firstLine="720"/>
+        <w:jc w:val="both"/>
+      </w:pPr>
+      <w:r>
+        <w:rPr>
+          <w:rFonts w:ascii="Times New Roman" w:hAnsi="Times New Roman"/>
+          <w:b w:val="0"/>
+          <w:i w:val="0"/>
+          <w:sz w:val="26"/>
+        </w:rPr>
+        <w:t>- Phương pháp thực nghiệm: Thiết kế giao diện UI/UX trên Figma theo nhận diện TDMU; lập trình xây dựng hệ thống với Laravel và MySQL; tích hợp API AI và Cronjob hẹn giờ; kiểm thử chức năng (Black-box testing) và đo lường hiệu năng.</w:t>
       </w:r>
     </w:p>
     <w:p>
@@ -4599,7 +4864,7 @@
           <w:b/>
           <w:sz w:val="26"/>
         </w:rPr>
-        <w:t>1.1. Khảo sát hiện trạng</w:t>
+        <w:t>1.1. Khảo sát hiện trạng công tác truyền thông tại Công đoàn TDMU</w:t>
       </w:r>
     </w:p>
     <w:p>
@@ -4615,7 +4880,7 @@
           <w:i w:val="0"/>
           <w:sz w:val="26"/>
         </w:rPr>
-        <w:t>Công đoàn cơ sở Trường Đại học Thủ Dầu Một là tổ chức công đoàn trường đại học lớn tại tỉnh Bình Dương. Hiện tại, Công đoàn trường đã có cổng thông tin điện tử tại địa chỉ congdoan.tdmu.edu.vn phục vụ việc đăng tải các hoạt động, thông báo, phong trào thi đua và văn bản chỉ đạo. Cổng thông tin được thiết kế với cơ cấu tổ chức gồm Ban Chấp hành (13 thành viên do TS. Lê Thị Kim Út làm Chủ tịch), Ủy ban Kiểm tra (3 thành viên do ThS. Nguyễn Minh Danh làm Chủ nhiệm), 4 Ban chuyên môn quần chúng và danh bạ 16 Tổ Công đoàn trực thuộc.</w:t>
+        <w:t>Công đoàn Trường Đại học Thủ Dầu Một là tổ chức chính trị - xã hội đại diện cho hơn 1.200 cán bộ, giảng viên và người lao động trong toàn trường. Công tác truyền thông giữ vai trò là kênh phát ngôn chính thức, đảm nhận các nhiệm vụ trọng yếu:</w:t>
       </w:r>
     </w:p>
     <w:p>
@@ -4631,7 +4896,7 @@
           <w:i w:val="0"/>
           <w:sz w:val="26"/>
         </w:rPr>
-        <w:t>Qua quá trình khảo sát trực tiếp, nhóm nghiên cứu nhận thấy hiện trạng hoạt động còn tồn tại các vấn đề lớn sau:</w:t>
+        <w:t>- Tuyên truyền, phổ biến các chủ trương của Đảng, chính sách pháp luật của Nhà nước và các chỉ đạo của Công đoàn cấp trên.</w:t>
       </w:r>
     </w:p>
     <w:p>
@@ -4647,7 +4912,7 @@
           <w:i w:val="0"/>
           <w:sz w:val="26"/>
         </w:rPr>
-        <w:t>Thứ nhất, về Cổng thông tin điện tử: Website hiện tại chủ yếu phục vụ việc phát tin một chiều, giao diện chưa tối ưu trải nghiệm tương tác trực tuyến của đoàn viên. Việc quản lý vòng đời tin tức từ khâu soạn thảo, kiểm duyệt đến xuất bản còn thiếu các công cụ hỗ trợ thông minh như tóm tắt tự động hay trích xuất từ khóa.</w:t>
+        <w:t>- Cập nhật tin tức về các hoạt động phong trào: thi đua dạy tốt - học tốt, hội thao, văn nghệ, hoạt động vì cộng đồng.</w:t>
       </w:r>
     </w:p>
     <w:p>
@@ -4663,7 +4928,7 @@
           <w:i w:val="0"/>
           <w:sz w:val="26"/>
         </w:rPr>
-        <w:t>Thứ hai, về công tác quản lý Báo cáo thi đua 16 Tổ Công đoàn: Hàng tháng, các Tổ Công đoàn phải gửi báo cáo đánh giá thi đua theo biểu mẫu Google Forms với 24 chỉ tiêu phức tạp (gồm số liệu đoàn viên, phát triển Đảng, người mắc bệnh hiểm nghèo, số tiền chăm lo, tai nạn lao động, kiểm tra, tuyên truyền, kế hoạch tháng tới và đính kèm đường link thư mục Google Drive chứa hình ảnh minh chứng). Việc thu thập qua Google Forms khiến số liệu bị phân tán trên các bảng tính rời rạc, Ban Thường vụ không thể theo dõi tiến độ nộp theo thời gian thực, không có cơ chế xếp loại thi đua tự động và việc trích xuất số liệu tổng hợp rất vất vả.</w:t>
+        <w:t>- Công khai các chế độ phúc lợi, chính sách bảo hiểm, chăm lo đời sống, trợ cấp khó khăn và các hoạt động nữ công.</w:t>
       </w:r>
     </w:p>
     <w:p>
@@ -4679,21 +4944,7 @@
           <w:i w:val="0"/>
           <w:sz w:val="26"/>
         </w:rPr>
-        <w:t>Do đó, việc xây dựng một hệ thống tích hợp trực tiếp Cổng thông tin điện tử với Phân hệ quản trị Báo cáo thi đua 16 Tổ và ứng dụng Trí tuệ Nhân tạo là hết sức cần thiết và cấp bách.</w:t>
-      </w:r>
-    </w:p>
-    <w:p>
-      <w:pPr>
-        <w:spacing w:before="160" w:after="80" w:line="312" w:lineRule="auto"/>
-        <w:ind w:firstLine="0"/>
-      </w:pPr>
-      <w:r>
-        <w:rPr>
-          <w:rFonts w:ascii="Times New Roman" w:hAnsi="Times New Roman"/>
-          <w:b/>
-          <w:sz w:val="26"/>
-        </w:rPr>
-        <w:t>1.2. Khảo sát phần cứng</w:t>
+        <w:t>- Đăng tải các thông báo quan trọng, lịch công tác tuần/tháng và các biểu mẫu quy định nghiệp vụ.</w:t>
       </w:r>
     </w:p>
     <w:p>
@@ -4709,7 +4960,118 @@
           <w:i w:val="0"/>
           <w:sz w:val="26"/>
         </w:rPr>
-        <w:t>Khảo sát hạ tầng thiết bị và phần cứng tại Văn phòng Công đoàn và các đơn vị trực thuộc Trường Đại học Thủ Dầu Một được tổng hợp trong Bảng 1.1 dưới đây:</w:t>
+        <w:t>Hiện nay, các kênh truyền thông chủ yếu của Công đoàn trường bao gồm: phân mục tin tức trên Website trường, Fanpage Facebook Công đoàn TDMU và các nhóm trao đổi Zalo. Mặc dù đã đáp ứng được việc phát đi thông tin cơ bản, nhưng qua khảo sát chi tiết, quy trình vận hành hiện tại bộc lộ nhiều điểm nghẽn công nghệ:</w:t>
+      </w:r>
+    </w:p>
+    <w:p>
+      <w:pPr>
+        <w:spacing w:before="0" w:after="120" w:line="312" w:lineRule="auto"/>
+        <w:ind w:firstLine="720"/>
+        <w:jc w:val="both"/>
+      </w:pPr>
+      <w:r>
+        <w:rPr>
+          <w:rFonts w:ascii="Times New Roman" w:hAnsi="Times New Roman"/>
+          <w:b w:val="0"/>
+          <w:i w:val="0"/>
+          <w:sz w:val="26"/>
+        </w:rPr>
+        <w:t>1. Áp lực kiêm nhiệm và sự chậm trễ thông tin: Đội ngũ cán bộ phụ trách công tác thông tin - truyền thông của Công đoàn đều là giảng viên hoặc chuyên viên kiêm nhiệm. Khi bước vào cao điểm giảng dạy, coi thi hoặc tổng kết năm học, việc soạn thảo tin tức về các sự kiện phong trào thường bị dồn ứ, chậm phát hành từ 3 đến 5 ngày, làm giảm tính thời sự của thông tin.</w:t>
+      </w:r>
+    </w:p>
+    <w:p>
+      <w:pPr>
+        <w:spacing w:before="0" w:after="120" w:line="312" w:lineRule="auto"/>
+        <w:ind w:firstLine="720"/>
+        <w:jc w:val="both"/>
+      </w:pPr>
+      <w:r>
+        <w:rPr>
+          <w:rFonts w:ascii="Times New Roman" w:hAnsi="Times New Roman"/>
+          <w:b w:val="0"/>
+          <w:i w:val="0"/>
+          <w:sz w:val="26"/>
+        </w:rPr>
+        <w:t>2. Khó khăn trong khâu sáng tạo nội dung và đa phương tiện: Việc viết một bài báo truyền thông chuẩn mực đòi hỏi kỹ năng hành văn trang trọng, chuẩn xác về thuật ngữ đoàn thể nhưng vẫn phải hấp dẫn người đọc. Đặt tiêu đề sao cho thu hút bạn đọc trên môi trường mạng xã hội là thách thức không nhỏ. Đặc biệt, khâu thiết kế ảnh banner và sản xuất video ngắn (Shorts/Reels) tóm tắt sự kiện đòi hỏi phần mềm chuyên dụng và kỹ năng đồ họa phức tạp mà đa số cán bộ kiêm nhiệm chưa được đào tạo bài bản.</w:t>
+      </w:r>
+    </w:p>
+    <w:p>
+      <w:pPr>
+        <w:spacing w:before="0" w:after="120" w:line="312" w:lineRule="auto"/>
+        <w:ind w:firstLine="720"/>
+        <w:jc w:val="both"/>
+      </w:pPr>
+      <w:r>
+        <w:rPr>
+          <w:rFonts w:ascii="Times New Roman" w:hAnsi="Times New Roman"/>
+          <w:b w:val="0"/>
+          <w:i w:val="0"/>
+          <w:sz w:val="26"/>
+        </w:rPr>
+        <w:t>3. Quy trình đăng tải thủ công và phân tán: Mỗi bài viết sau khi được kiểm duyệt phải đăng tải thủ công lên Website, sau đó cán bộ phải mở Facebook để đăng lại bài viết, tải lại hình ảnh lên Fanpage. Thao tác lặp đi lặp lại tốn kém thời gian và dễ dẫn đến sai sót, lệch thông tin giữa các kênh.</w:t>
+      </w:r>
+    </w:p>
+    <w:p>
+      <w:pPr>
+        <w:spacing w:before="0" w:after="120" w:line="312" w:lineRule="auto"/>
+        <w:ind w:firstLine="720"/>
+        <w:jc w:val="both"/>
+      </w:pPr>
+      <w:r>
+        <w:rPr>
+          <w:rFonts w:ascii="Times New Roman" w:hAnsi="Times New Roman"/>
+          <w:b w:val="0"/>
+          <w:i w:val="0"/>
+          <w:sz w:val="26"/>
+        </w:rPr>
+        <w:t>4. Thiếu tính năng lập lịch xuất bản tự động: Hiện tại, để bài viết xuất hiện vào khung giờ có nhiều người đọc (khoảng 19h30 - 21h30 hoặc các ngày cuối tuần), cán bộ phải trực tiếp mở máy tính để thao tác đăng bài. Việc thiếu cơ chế hẹn giờ tự động (Scheduler) làm giảm đáng kể hiệu quả tiếp cận của bài viết.</w:t>
+      </w:r>
+    </w:p>
+    <w:p>
+      <w:pPr>
+        <w:spacing w:before="0" w:after="120" w:line="312" w:lineRule="auto"/>
+        <w:ind w:firstLine="720"/>
+        <w:jc w:val="both"/>
+      </w:pPr>
+      <w:r>
+        <w:rPr>
+          <w:rFonts w:ascii="Times New Roman" w:hAnsi="Times New Roman"/>
+          <w:b w:val="0"/>
+          <w:i w:val="0"/>
+          <w:sz w:val="26"/>
+        </w:rPr>
+        <w:t>5. Không có công cụ đo lường và thống kê tập trung: Ban Chấp hành chưa có một bảng điều khiển (Dashboard) thống kê định lượng xem bài viết nào có lượt đọc cao, bài viết nào nhận được nhiều tương tác, tỷ lệ đoàn viên quan tâm đến các chủ đề chính sách ra sao để có căn cứ cải tiến chất lượng tuyên truyền.</w:t>
+      </w:r>
+    </w:p>
+    <w:p>
+      <w:pPr>
+        <w:spacing w:before="160" w:after="80" w:line="312" w:lineRule="auto"/>
+        <w:ind w:firstLine="0"/>
+      </w:pPr>
+      <w:r>
+        <w:rPr>
+          <w:rFonts w:ascii="Times New Roman" w:hAnsi="Times New Roman"/>
+          <w:b/>
+          <w:sz w:val="26"/>
+        </w:rPr>
+        <w:br/>
+        <w:t>1.2. Khảo sát phần cứng và hạ tầng công nghệ</w:t>
+      </w:r>
+    </w:p>
+    <w:p>
+      <w:pPr>
+        <w:spacing w:before="0" w:after="120" w:line="312" w:lineRule="auto"/>
+        <w:ind w:firstLine="720"/>
+        <w:jc w:val="both"/>
+      </w:pPr>
+      <w:r>
+        <w:rPr>
+          <w:rFonts w:ascii="Times New Roman" w:hAnsi="Times New Roman"/>
+          <w:b w:val="0"/>
+          <w:i w:val="0"/>
+          <w:sz w:val="26"/>
+        </w:rPr>
+        <w:t>Để đảm bảo việc triển khai Website truyền thông tích hợp AI và mạng xã hội đạt hiệu năng cao, nhóm đã tiến hành khảo sát cơ sở hạ tầng phần cứng và thiết bị hiện có tại đơn vị. Kết quả khảo sát được tổng hợp chi tiết trong Bảng 1.1:</w:t>
       </w:r>
     </w:p>
     <w:p>
@@ -4769,7 +5131,7 @@
           </w:tcPr>
           <w:p>
             <w:r>
-              <w:t>Máy tính để bàn (PC), máy tính xách tay (Laptop), điện thoại thông minh (Smartphone), máy in văn phòng, hệ thống máy chủ CSDL.</w:t>
+              <w:t>Máy tính để bàn (PC), Máy tính xách tay (Laptop), Điện thoại thông minh (Smartphone), Máy chủ lưu trữ Web &amp; CSDL của Nhà trường.</w:t>
             </w:r>
           </w:p>
         </w:tc>
@@ -4806,7 +5168,7 @@
           </w:tcPr>
           <w:p>
             <w:r>
-              <w:t>Thiết bị hoạt động tốt, kết nối mạng Internet/Wifi cáp quang tốc độ cao của nhà trường ổn định và liên tục.</w:t>
+              <w:t>Thiết bị tại các văn phòng khoa, viện và phòng ban hoạt động ổn định; hạ tầng mạng cáp quang nội bộ và hệ thống Wifi của Trường ĐH Thủ Dầu Một thông suốt, băng thông cao và liên tục.</w:t>
             </w:r>
           </w:p>
         </w:tc>
@@ -4843,7 +5205,7 @@
           </w:tcPr>
           <w:p>
             <w:r>
-              <w:t>Máy tính cán bộ và đoàn viên đáp ứng tốt việc truy cập các ứng dụng Web hiện đại, xử lý dữ liệu và gửi nhận biểu mẫu trực tuyến nhanh chóng.</w:t>
+              <w:t>Máy tính văn phòng và thiết bị di động của cán bộ, đoàn viên đáp ứng rất tốt việc truy cập giao diện Web hiện đại, thao tác mượt mà trên trình soạn thảo CMS và hiển thị mượt mà hình ảnh, video chất lượng cao.</w:t>
             </w:r>
           </w:p>
         </w:tc>
@@ -4880,7 +5242,7 @@
           </w:tcPr>
           <w:p>
             <w:r>
-              <w:t>Tuân thủ đầy đủ các quy định về an toàn thông tin mạng của Bộ Thông tin &amp; Truyền thông và quy chế an ninh mạng của Trường ĐH Thủ Dầu Một.</w:t>
+              <w:t>Tuân thủ nghiêm ngặt Quy chế an toàn thông tin mạng của Bộ Thông tin &amp; Truyền thông và Quy chế bảo đảm an ninh mạng của Trường ĐH Thủ Dầu Một; kết nối an toàn qua chứng chỉ bảo mật HTTPS/SSL.</w:t>
             </w:r>
           </w:p>
         </w:tc>
@@ -4917,7 +5279,7 @@
           </w:tcPr>
           <w:p>
             <w:r>
-              <w:t>Không có lỗi phần cứng đáng kể; một số máy tính đời cũ đôi khi gặp hiện tượng giật lag nhẹ khi mở các bảng tính Excel dung lượng lớn.</w:t>
+              <w:t>Hầu như không có lỗi phần cứng đáng kể; trên một số máy tính cá nhân đời cũ đôi khi gặp hiện tượng lưu cache trình duyệt khi thay đổi phiên bản giao diện.</w:t>
             </w:r>
           </w:p>
         </w:tc>
@@ -4954,7 +5316,7 @@
           </w:tcPr>
           <w:p>
             <w:r>
-              <w:t>Hệ điều hành Windows 10/11, trình duyệt Google Chrome/Microsoft Edge bản mới nhất có hỗ trợ đầy đủ HTML5, CSS3, ES6+.</w:t>
+              <w:t>Hệ điều hành Windows 10/11, macOS, Android/iOS; trình duyệt Google Chrome, Microsoft Edge, Safari bản mới nhất hỗ trợ đầy đủ chuẩn HTML5, CSS3, JavaScript ES6+ và WebSockets.</w:t>
             </w:r>
           </w:p>
         </w:tc>
@@ -5003,7 +5365,7 @@
           <w:i w:val="0"/>
           <w:sz w:val="26"/>
         </w:rPr>
-        <w:t>Kế hoạch thực hiện khảo sát thu thập ý kiến được trình bày trong Bảng 1.2:</w:t>
+        <w:t>Kế hoạch thực hiện khảo sát thu thập ý kiến thực tế từ các bên liên quan được trình bày trong Bảng 1.2:</w:t>
       </w:r>
     </w:p>
     <w:p>
@@ -5018,7 +5380,7 @@
           <w:i/>
           <w:sz w:val="26"/>
         </w:rPr>
-        <w:t>Bảng 1.2: Kế hoạch khảo sát nhu cầu</w:t>
+        <w:t>Bảng 1.2: Kế hoạch khảo sát nhu cầu truyền thông</w:t>
       </w:r>
     </w:p>
     <w:tbl>
@@ -5063,7 +5425,7 @@
           </w:tcPr>
           <w:p>
             <w:r>
-              <w:t>20/08/2026 – 28/08/2026</w:t>
+              <w:t>15/10/2026 – 24/10/2026</w:t>
             </w:r>
           </w:p>
         </w:tc>
@@ -5100,7 +5462,7 @@
           </w:tcPr>
           <w:p>
             <w:r>
-              <w:t>Phỏng vấn trực tiếp kết hợp phiếu khảo sát câu hỏi trực tuyến</w:t>
+              <w:t>Phỏng vấn trực tiếp chuyên sâu kết hợp phiếu khảo sát trực tuyến trên Google Forms</w:t>
             </w:r>
           </w:p>
         </w:tc>
@@ -5137,7 +5499,7 @@
           </w:tcPr>
           <w:p>
             <w:r>
-              <w:t>5 – 6 câu hỏi trọng tâm / người</w:t>
+              <w:t>5 – 6 câu hỏi trọng tâm / đối tượng</w:t>
             </w:r>
           </w:p>
         </w:tc>
@@ -5211,7 +5573,7 @@
           </w:tcPr>
           <w:p>
             <w:r>
-              <w:t>Nắm bắt các khó khăn thực tế trong việc nộp báo cáo thi đua 16 Tổ và nhu cầu ứng dụng công nghệ AI vào hỗ trợ biên tập tin tức</w:t>
+              <w:t>Xác định rõ các điểm nghẽn trong quy trình tạo bài viết; nhu cầu ứng dụng Trợ lý AI vào viết bài, tạo ảnh/video; nhu cầu hẹn giờ xuất bản và đồng bộ Fanpage; các chỉ số thống kê Dashboard cần thiết</w:t>
             </w:r>
           </w:p>
         </w:tc>
@@ -5248,7 +5610,7 @@
           </w:tcPr>
           <w:p>
             <w:r>
-              <w:t>Lãnh đạo Thường trực Công đoàn trường, Cán bộ phụ trách phong trào thi đua, Tổ trưởng 16 Tổ Công đoàn và đoàn viên</w:t>
+              <w:t>Lãnh đạo Ban Chấp hành Công đoàn TDMU, Cán bộ phụ trách truyền thông, Biên tập viên kiêm nhiệm và Đoàn viên người đọc</w:t>
             </w:r>
           </w:p>
         </w:tc>
@@ -5285,7 +5647,7 @@
           </w:tcPr>
           <w:p>
             <w:r>
-              <w:t>Trong khuôn viên Trường Đại học Thủ Dầu Một</w:t>
+              <w:t>Văn phòng Công đoàn trường và các đơn vị trực thuộc Trường Đại học Thủ Dầu Một</w:t>
             </w:r>
           </w:p>
         </w:tc>
@@ -5320,7 +5682,7 @@
           <w:i w:val="0"/>
           <w:sz w:val="26"/>
         </w:rPr>
-        <w:t>Dưới đây là biên bản ghi nhận kết quả các cuộc phỏng vấn thực tế:</w:t>
+        <w:t>Dưới đây là biên bản ghi nhận kết quả các cuộc phỏng vấn thực tế với đại diện lãnh đạo và cán bộ phụ trách truyền thông:</w:t>
       </w:r>
     </w:p>
     <w:p>
@@ -5335,7 +5697,7 @@
           <w:i/>
           <w:sz w:val="26"/>
         </w:rPr>
-        <w:t>Bảng 1.3: Phiếu phỏng vấn Cán bộ Lãnh đạo Công đoàn TDMU</w:t>
+        <w:t>Bảng 1.3: Phiếu phỏng vấn Cán bộ Quản lý Truyền thông Công đoàn TDMU</w:t>
       </w:r>
     </w:p>
     <w:p>
@@ -5350,9 +5712,9 @@
           <w:i w:val="0"/>
           <w:sz w:val="26"/>
         </w:rPr>
-        <w:t>Người được phỏng vấn: ThS. Võ Quốc Lương – Ủy viên BCH Công đoàn Trường ĐH Thủ Dầu Một</w:t>
+        <w:t>Người được phỏng vấn: ThS. Võ Quốc Lương – Ủy viên Ban Chấp hành, Phụ trách truyền thông Công đoàn TDMU</w:t>
         <w:br/>
-        <w:t>Ngày phỏng vấn: 22/08/2026</w:t>
+        <w:t>Ngày phỏng vấn: 18/10/2026</w:t>
       </w:r>
     </w:p>
     <w:tbl>
@@ -5420,7 +5782,7 @@
           </w:tcPr>
           <w:p>
             <w:r>
-              <w:t>Thầy đánh giá như thế nào về công tác truyền thông của Công đoàn trường hiện nay?</w:t>
+              <w:t>Thầy đánh giá như thế nào về công tác truyền thông của Công đoàn trường hiện nay và các khó khăn lớn nhất?</w:t>
             </w:r>
           </w:p>
         </w:tc>
@@ -5436,7 +5798,7 @@
           </w:tcPr>
           <w:p>
             <w:r>
-              <w:t>Công đoàn trường đã duy trì website chính thức nhưng giao diện còn mang tính một chiều. Việc cập nhật tin bài đôi khi chưa nhanh do cán bộ đều làm việc kiêm nhiệm, cần một hệ thống quản trị hiện đại có trợ lý AI hỗ trợ biên soạn tin bài nhanh hơn.</w:t>
+              <w:t>Công đoàn trường đã duy trì các kênh thông tin nhưng quy trình còn phân tán. Khó khăn lớn nhất là cán bộ đều làm việc kiêm nhiệm, việc biên soạn tin tức về hoạt động phong trào tốn nhiều thời gian, dễ gây chậm trễ trong việc cập nhật thông tin kịp thời đến đoàn viên.</w:t>
             </w:r>
           </w:p>
         </w:tc>
@@ -5454,7 +5816,7 @@
           </w:tcPr>
           <w:p>
             <w:r>
-              <w:t>Quy trình thu thập Báo cáo tháng của 16 Tổ Công đoàn hiện đang gặp những vướng mắc gì?</w:t>
+              <w:t>Công đoàn trường có định hướng và mong muốn ứng dụng Trí tuệ nhân tạo (AI) vào các khâu nào?</w:t>
             </w:r>
           </w:p>
         </w:tc>
@@ -5470,7 +5832,7 @@
           </w:tcPr>
           <w:p>
             <w:r>
-              <w:t>Hiện tại trường dùng Google Forms với 24 chỉ tiêu rất đầy đủ nhưng việc tổng hợp lại rất thủ công. Ban Thường vụ khó nắm bắt tiến độ nộp theo thời gian thực và mất nhiều thời gian cộng dồn tiền chăm lo, đếm số đoàn viên.</w:t>
+              <w:t>Chúng tôi rất ủng hộ việc đưa AI vào hỗ trợ: AI có thể giúp gợi ý tiêu đề thu hút, soạn thảo bản thảo bài viết dựa trên từ khóa sự kiện theo đúng văn phong chuẩn mực của tổ chức đoàn thể, tóm tắt tin tức ngắn gọn và gợi ý tạo hình ảnh/video minh họa.</w:t>
             </w:r>
           </w:p>
         </w:tc>
@@ -5488,7 +5850,7 @@
           </w:tcPr>
           <w:p>
             <w:r>
-              <w:t>Nhà trường có định hướng gì về việc chuyển đổi số phân hệ thi đua này?</w:t>
+              <w:t>Về quy trình quản lý và kiểm duyệt bài viết, nhà trường có yêu cầu gì đối với hệ thống mới?</w:t>
             </w:r>
           </w:p>
         </w:tc>
@@ -5504,7 +5866,7 @@
           </w:tcPr>
           <w:p>
             <w:r>
-              <w:t>Công đoàn trường rất ủng hộ việc xây dựng một phân hệ Báo cáo thi đua riêng biệt trên website. Cần có Bảng tổng hợp KPI (tiến độ nộp, kinh phí chăm lo), xem được chi tiết 24 chỉ tiêu và link minh chứng Google Drive của từng tổ.</w:t>
+              <w:t>Bắt buộc phải có cơ chế phân quyền rõ ràng 3 cấp: Quản trị viên (Admin), Biên tập viên (Editor), Cộng tác viên (Contributor). Dù có AI hỗ trợ thì 100% nội dung bài viết trước khi phát hành ra công chúng đều phải qua kiểm duyệt và phê duyệt của Ban Chấp hành.</w:t>
             </w:r>
           </w:p>
         </w:tc>
@@ -5522,7 +5884,7 @@
           </w:tcPr>
           <w:p>
             <w:r>
-              <w:t>Thầy có yêu cầu gì về cơ cấu tổ chức và các phân loại trên hệ thống mới?</w:t>
+              <w:t>Tính năng hẹn giờ xuất bản bài viết và đồng bộ lên Fanpage Facebook có thực sự cần thiết không?</w:t>
             </w:r>
           </w:p>
         </w:tc>
@@ -5538,7 +5900,7 @@
           </w:tcPr>
           <w:p>
             <w:r>
-              <w:t>Hệ thống mới phải giữ đúng nhận diện của trường, phân chia đúng 13 ủy viên Ban Chấp hành, 3 ủy viên Ủy ban Kiểm tra, 4 Ban chuyên môn và 4 nhóm văn bản chuẩn (Công văn tuyên truyền, Kế hoạch, Luật, Quyết định).</w:t>
+              <w:t>Cực kỳ cần thiết! Fanpage Công đoàn có lượng tương tác rất lớn vào các khung giờ buổi tối. Nếu hệ thống cho phép hẹn giờ tự động xuất bản lên Website và tự đẩy bài viết, hình ảnh sang Fanpage qua Facebook API thì sẽ giải phóng rất nhiều công sức cho cán bộ.</w:t>
             </w:r>
           </w:p>
         </w:tc>
@@ -5556,7 +5918,7 @@
           </w:tcPr>
           <w:p>
             <w:r>
-              <w:t>Thầy kỳ vọng gì vào sản phẩm đồ án của nhóm sinh viên?</w:t>
+              <w:t>Ban Chấp hành Công đoàn cần theo dõi những số liệu thống kê nào để đánh giá hiệu quả truyền thông?</w:t>
             </w:r>
           </w:p>
         </w:tc>
@@ -5572,7 +5934,7 @@
           </w:tcPr>
           <w:p>
             <w:r>
-              <w:t>Kỳ vọng nhóm xây dựng được một hệ thống hoàn chỉnh, chạy thực tế mượt mà, phân quyền rõ ràng giữa Admin, Biên tập viên và 16 Tổ trưởng để có thể đưa vào ứng dụng thử nghiệm ngay tại trường.</w:t>
+              <w:t>Cần có Dashboard trực quan hiển thị số lượt xem bài viết, lượt thích, bình luận, chia sẻ đa kênh, và danh sách xếp hạng các bài viết được quan tâm nhất theo tuần/tháng để định hướng nội dung tuyên truyền phù hợp.</w:t>
             </w:r>
           </w:p>
         </w:tc>
@@ -5608,7 +5970,7 @@
           <w:i/>
           <w:sz w:val="26"/>
         </w:rPr>
-        <w:t>Bảng 1.4: Phiếu phỏng vấn Tổ trưởng Tổ Công đoàn Cơ sở</w:t>
+        <w:t>Bảng 1.4: Phiếu phỏng vấn Biên tập viên &amp; Cán bộ Truyền thông kiêm nhiệm</w:t>
       </w:r>
     </w:p>
     <w:p>
@@ -5623,9 +5985,9 @@
           <w:i w:val="0"/>
           <w:sz w:val="26"/>
         </w:rPr>
-        <w:t>Người được phỏng vấn: ThS. Hồ Ngọc Trung Kiên – Tổ trưởng Tổ Công đoàn Viện Công nghệ số</w:t>
+        <w:t>Người được phỏng vấn: Cán bộ Biên tập viên / Truyền thông Công đoàn TDMU</w:t>
         <w:br/>
-        <w:t>Ngày phỏng vấn: 25/08/2026</w:t>
+        <w:t>Ngày phỏng vấn: 20/10/2026</w:t>
       </w:r>
     </w:p>
     <w:tbl>
@@ -5693,7 +6055,7 @@
           </w:tcPr>
           <w:p>
             <w:r>
-              <w:t>Thầy gặp những khó khăn gì khi nộp Báo cáo tháng qua Google Forms hiện nay?</w:t>
+              <w:t>Trong quá trình biên soạn bài viết cho Công đoàn, khâu nào khiến chị mất nhiều thời gian nhất?</w:t>
             </w:r>
           </w:p>
         </w:tc>
@@ -5709,7 +6071,7 @@
           </w:tcPr>
           <w:p>
             <w:r>
-              <w:t>Biểu mẫu gồm 24 trường thông tin khá dài, khi nộp qua Google Form nhiều khi không lưu lại được bản sao để tổ tự đối chiếu. Thêm vào đó, nộp xong không biết trường đã nhận được hay chưa vì không có bảng tổng hợp trực quan.</w:t>
+              <w:t>Mất nhiều thời gian nhất ở khâu tìm ý tưởng triển khai bài viết, đặt tiêu đề sao cho vừa trang trọng vừa thu hút, và khâu xử lý, tìm kiếm hoặc cắt ghép hình ảnh banner/video tóm tắt minh họa sự kiện cho bắt mắt.</w:t>
             </w:r>
           </w:p>
         </w:tc>
@@ -5727,7 +6089,7 @@
           </w:tcPr>
           <w:p>
             <w:r>
-              <w:t>Thầy có mong muốn gì về biểu mẫu nộp báo cáo trên hệ thống mới?</w:t>
+              <w:t>Nếu có Trợ lý AI tích hợp ngay trong trình soạn thảo, chị mong đợi những công cụ cụ thể nào?</w:t>
             </w:r>
           </w:p>
         </w:tc>
@@ -5743,7 +6105,7 @@
           </w:tcPr>
           <w:p>
             <w:r>
-              <w:t>Rất mong muốn hệ thống có form trực tuyến nhúng ngay trên web, nộp xong là thấy tên tổ mình chuyển sang trạng thái 'Đã nộp' trên Bảng thi đua, có chỗ dán link Google Drive minh chứng hoạt động của tổ.</w:t>
+              <w:t>Mong muốn có nút bấm AI gợi ý nhiều phương án tiêu đề; một chức năng sinh nhanh bài viết hoàn chỉnh từ dàn ý thô; công cụ tự động tóm tắt thành 2 - 3 câu để đăng status lên mạng xã hội; và gợi ý prompt tạo ảnh minh họa hoặc kịch bản video ngắn.</w:t>
             </w:r>
           </w:p>
         </w:tc>
@@ -5761,7 +6123,7 @@
           </w:tcPr>
           <w:p>
             <w:r>
-              <w:t>Tổ công đoàn có nhu cầu theo dõi số liệu thi đua của các tổ khác không?</w:t>
+              <w:t>Việc quản lý hình ảnh và video sự kiện của Công đoàn hiện nay đang gặp khó khăn gì?</w:t>
             </w:r>
           </w:p>
         </w:tc>
@@ -5777,7 +6139,7 @@
           </w:tcPr>
           <w:p>
             <w:r>
-              <w:t>Có chứ, việc công khai Bảng tổng hợp thi đua 16 Tổ sẽ tạo động lực thi đua rất lớn giữa các đơn vị, giúp các tổ học hỏi mô hình hay trong công tác chăm lo đời sống và tuyên truyền.</w:t>
+              <w:t>Hình ảnh và video thường được gửi rải rác qua Zalo hoặc lưu trên Google Drive cá nhân của từng người. Khi cần tìm lại hình ảnh hoạt động của năm trước rất khó khăn. Cần một kho Media Library tập trung gắn liền với bài viết.</w:t>
             </w:r>
           </w:p>
         </w:tc>
@@ -5795,7 +6157,7 @@
           </w:tcPr>
           <w:p>
             <w:r>
-              <w:t>Về các chế độ phúc lợi và biểu mẫu, thầy thấy cần cải tiến điểm gì?</w:t>
+              <w:t>Chị thấy thao tác đăng bài lặp lại lên cả Website và Fanpage Facebook gây trở ngại như thế nào?</w:t>
             </w:r>
           </w:p>
         </w:tc>
@@ -5811,7 +6173,7 @@
           </w:tcPr>
           <w:p>
             <w:r>
-              <w:t>Cần có nơi tập trung tải nhanh các biểu mẫu như đơn gia nhập công đoàn, mẫu báo cáo và quy định trợ cấp khó khăn để đoàn viên trong viện tải về nhanh chóng mà không cần phải đi hỏi nhiều nơi.</w:t>
+              <w:t>Rất bất tiện vì phải copy paste nhiều lần, định dạng lại văn bản và upload ảnh hai lượt. Nếu hệ thống cho phép viết một lần trên Website rồi bấm tùy chọn tự động đồng bộ sang Fanpage Facebook thì sẽ tiết kiệm được 70% thời gian.</w:t>
             </w:r>
           </w:p>
         </w:tc>
@@ -5829,7 +6191,7 @@
           </w:tcPr>
           <w:p>
             <w:r>
-              <w:t>Thầy đánh giá thế nào về việc đưa Trợ lý AI vào hỗ trợ biên tập tin bài?</w:t>
+              <w:t>Chị có mong muốn theo dõi mức độ tương tác của đoàn viên đối với bài viết của mình không?</w:t>
             </w:r>
           </w:p>
         </w:tc>
@@ -5845,7 +6207,7 @@
           </w:tcPr>
           <w:p>
             <w:r>
-              <w:t>Rất hữu ích! Nếu AI có thể giúp tóm tắt bài viết sự kiện hoặc gợi ý tiêu đề chuẩn thì các tổ trưởng kiêm nhiệm như chúng tôi sẽ tiết kiệm được rất nhiều thời gian khi gửi tin bài phong trào lên trường.</w:t>
+              <w:t>Rất mong muốn! Tôi cần biết bài viết có bao nhiêu lượt xem, lượt like và bình luận của bạn đọc để biết chủ đề nào đoàn viên yêu thích, từ đó cải tiến cách viết bài cho các sự kiện tiếp theo.</w:t>
             </w:r>
           </w:p>
         </w:tc>
@@ -5894,7 +6256,7 @@
           <w:i w:val="0"/>
           <w:sz w:val="26"/>
         </w:rPr>
-        <w:t>Hệ thống Cổng thông tin điện tử hỗ trợ người dùng (Đoàn viên, Giảng viên, Tổ trưởng 16 Tổ) trong công việc:</w:t>
+        <w:t>Hệ thống Website truyền thông hỗ trợ đoàn viên, cán bộ giảng viên và độc giả trong việc tiếp nhận thông tin và tương tác:</w:t>
       </w:r>
     </w:p>
     <w:p>
@@ -5909,7 +6271,7 @@
           <w:i w:val="0"/>
           <w:sz w:val="26"/>
         </w:rPr>
-        <w:t>- Tra cứu, theo dõi tin tức hoạt động, sự kiện công đoàn trên giao diện 2 cột chuẩn tỷ lệ 9:3 của trường.</w:t>
+        <w:t>- Tra cứu, xem danh sách tin tức, thông báo, sự kiện Công đoàn được phân loại trực quan theo chuyên mục (Hoạt động phong trào, Tuyên truyền giáo dục, Chế độ chính sách, Nữ công, Thi đua khen thưởng).</w:t>
       </w:r>
     </w:p>
     <w:p>
@@ -5924,7 +6286,7 @@
           <w:i w:val="0"/>
           <w:sz w:val="26"/>
         </w:rPr>
-        <w:t>- Xem minh bạch cơ cấu nhân sự Ban Chấp hành (13 đồng chí), Ủy ban Kiểm tra (3 đồng chí) và danh bạ 16 Tổ Công đoàn.</w:t>
+        <w:t>- Tìm kiếm bài viết thông minh: Người dùng có thể tìm kiếm theo từ khóa trong tiêu đề, nội dung, tìm theo tác giả hoặc khoảng thời gian đăng tải.</w:t>
       </w:r>
     </w:p>
     <w:p>
@@ -5939,7 +6301,7 @@
           <w:i w:val="0"/>
           <w:sz w:val="26"/>
         </w:rPr>
-        <w:t>- Tra cứu và tải về các văn bản quy phạm pháp luật, kế hoạch hoạt động và biểu mẫu nghiệp vụ theo 4 phân loại chuẩn.</w:t>
+        <w:t>- Xem chi tiết bài viết chất lượng cao: Nội dung trình bày trang trọng, rõ ràng, tích hợp album hình ảnh độ phân giải cao và video clip sự kiện nhúng trực tiếp.</w:t>
       </w:r>
     </w:p>
     <w:p>
@@ -5954,7 +6316,7 @@
           <w:i w:val="0"/>
           <w:sz w:val="26"/>
         </w:rPr>
-        <w:t>- Nộp Báo cáo Tháng của Tổ Công đoàn trực tuyến với đầy đủ 24 chỉ tiêu số liệu và đính kèm link Drive minh chứng.</w:t>
+        <w:t>- Tương tác với bài viết: Người đọc có thể bấm 'Thích' (Like), gửi bình luận đóng góp ý kiến dưới bài viết, và chia sẻ nhanh bài viết lên các nền tảng mạng xã hội (Facebook, Zalo) qua liên kết trực tiếp.</w:t>
       </w:r>
     </w:p>
     <w:p>
@@ -5969,22 +6331,7 @@
           <w:i w:val="0"/>
           <w:sz w:val="26"/>
         </w:rPr>
-        <w:t>- Theo dõi kết quả thi đua và đo lường KPI thời gian thực của 16 Tổ Công đoàn trên toàn trường.</w:t>
-      </w:r>
-    </w:p>
-    <w:p>
-      <w:pPr>
-        <w:spacing w:before="0" w:after="120" w:line="312" w:lineRule="auto"/>
-        <w:jc w:val="both"/>
-      </w:pPr>
-      <w:r>
-        <w:rPr>
-          <w:rFonts w:ascii="Times New Roman" w:hAnsi="Times New Roman"/>
-          <w:b w:val="0"/>
-          <w:i w:val="0"/>
-          <w:sz w:val="26"/>
-        </w:rPr>
-        <w:t>- Nộp đơn đề nghị hỗ trợ khó khăn, bệnh hiểm nghèo và gửi phản ánh, kiến nghị trực tuyến đến Ban Thường vụ.</w:t>
+        <w:t>- Trải nghiệm đa nền tảng tối ưu (Responsive): Giao diện tự động co giãn tối ưu trên mọi kích thước màn hình từ Máy tính để bàn (PC/Laptop), Máy tính bảng (Tablet) đến Điện thoại di động (Smartphone).</w:t>
       </w:r>
     </w:p>
     <w:p>
@@ -6015,7 +6362,7 @@
           <w:i w:val="0"/>
           <w:sz w:val="26"/>
         </w:rPr>
-        <w:t>Hệ thống hỗ trợ nhà quản lý (Ban Thường vụ, Ban Tuyên giáo - Thi đua, Quản trị viên) trong việc:</w:t>
+        <w:t>Hệ thống hỗ trợ Ban Chấp hành Công đoàn, Ban Tuyên giáo, Biên tập viên và Quản trị viên trong toàn bộ chu trình quản lý truyền thông:</w:t>
       </w:r>
     </w:p>
     <w:p>
@@ -6030,7 +6377,7 @@
           <w:i w:val="0"/>
           <w:sz w:val="26"/>
         </w:rPr>
-        <w:t>- Giám sát thời gian thực tiến độ nộp báo cáo thi đua của 16 Tổ Công đoàn qua bộ thẻ KPI tự động.</w:t>
+        <w:t>- Quản trị tài khoản và phân quyền người dùng theo 3 vai trò chuẩn mực: Quản trị viên (Admin), Biên tập viên (Editor), Cộng tác viên (Contributor).</w:t>
       </w:r>
     </w:p>
     <w:p>
@@ -6045,7 +6392,7 @@
           <w:i w:val="0"/>
           <w:sz w:val="26"/>
         </w:rPr>
-        <w:t>- Xem chi tiết 24 chỉ tiêu số liệu của từng tổ và truy cập link Google Drive để thẩm định minh chứng phục vụ xét thi đua.</w:t>
+        <w:t>- Quản lý toàn diện nội dung truyền thông: Quản lý danh mục bài viết, thêm mới, biên tập, chỉnh sửa nội dung rich-text và quản lý kho thư viện hình ảnh/video tập trung.</w:t>
       </w:r>
     </w:p>
     <w:p>
@@ -6060,7 +6407,7 @@
           <w:i w:val="0"/>
           <w:sz w:val="26"/>
         </w:rPr>
-        <w:t>- Xuất dữ liệu Bảng tổng hợp thi đua 16 Tổ ra file Excel (.xlsx) phục vụ họp giao ban lãnh đạo.</w:t>
+        <w:t>- Quy trình kiểm duyệt bài viết 4 bước nghiêm ngặt: Bản nháp (Draft) -&gt; Chờ duyệt (Pending) -&gt; Đã duyệt (Approved) -&gt; Xuất bản (Published) / Đã lên lịch (Scheduled), đảm bảo tính chính xác và định hướng chính trị của nội dung.</w:t>
       </w:r>
     </w:p>
     <w:p>
@@ -6075,7 +6422,7 @@
           <w:i w:val="0"/>
           <w:sz w:val="26"/>
         </w:rPr>
-        <w:t>- Quản trị quy trình đăng tải tin bài qua 4 bước kiểm duyệt: Bản nháp -&gt; Chờ duyệt -&gt; Đã duyệt -&gt; Xuất bản.</w:t>
+        <w:t>- Trợ lý Trí tuệ nhân tạo (AI Studio) hỗ trợ sáng tạo nội dung đa năng: Tự động tạo bản thảo bài viết từ từ khóa, gợi ý tiêu đề thu hút, tóm tắt tin tức tự động và hỗ trợ gợi ý ý tưởng, prompt hình ảnh banner và kịch bản video ngắn.</w:t>
       </w:r>
     </w:p>
     <w:p>
@@ -6090,7 +6437,7 @@
           <w:i w:val="0"/>
           <w:sz w:val="26"/>
         </w:rPr>
-        <w:t>- Sử dụng Trợ lý AI Studio: Tự động sinh bài viết từ từ khóa, gợi ý tiêu đề, tự động tóm tắt tin bài bằng thuật toán NLP (TF-IDF) và trích xuất từ khóa SEO.</w:t>
+        <w:t>- Quản lý lịch đăng bài (Scheduler &amp; Cronjob): Thiết lập lịch hẹn ngày/giờ xuất bản bài viết tự động theo khung giờ tối ưu lượng tiếp cận.</w:t>
       </w:r>
     </w:p>
     <w:p>
@@ -6105,25 +6452,22 @@
           <w:i w:val="0"/>
           <w:sz w:val="26"/>
         </w:rPr>
-        <w:t>- Quản trị phân quyền tài khoản người dùng và duy trì sao lưu, đồng bộ cơ sở dữ liệu 2 tầng (Microsoft SQL Server &amp; JSON Engine).</w:t>
-      </w:r>
-    </w:p>
-    <w:p>
-      <w:r>
-        <w:br w:type="page"/>
+        <w:t>- Tự động đồng bộ xuất bản lên Fanpage Facebook: Tích hợp Facebook Graph API để khi bài viết được duyệt xuất bản trên Website, hệ thống sẽ tự động đăng bài viết kèm hình ảnh và link sang Fanpage Công đoàn trường.</w:t>
       </w:r>
     </w:p>
     <w:p>
       <w:pPr>
-        <w:jc w:val="left"/>
+        <w:spacing w:before="0" w:after="120" w:line="312" w:lineRule="auto"/>
+        <w:jc w:val="both"/>
       </w:pPr>
       <w:r>
         <w:rPr>
-          <w:i/>
-          <w:sz w:val="20"/>
+          <w:rFonts w:ascii="Times New Roman" w:hAnsi="Times New Roman"/>
+          <w:b w:val="0"/>
+          <w:i w:val="0"/>
+          <w:sz w:val="26"/>
         </w:rPr>
-        <w:t>Đồ án cơ sở ngành                                                                                         Trang 8</w:t>
-        <w:br/>
+        <w:t>- Đo lường và thống kê hiệu quả truyền thông (Dashboard Analytics): Cung cấp biểu đồ trực quan thống kê lượt xem, lượt thích, bình luận, chia sẻ đa kênh và xếp hạng Top bài viết nổi bật phục vụ công tác báo cáo định kỳ.</w:t>
       </w:r>
     </w:p>
     <w:p>
@@ -6137,6 +6481,7 @@
           <w:b/>
           <w:sz w:val="26"/>
         </w:rPr>
+        <w:br/>
         <w:t>1.5. Phân tích chức năng</w:t>
       </w:r>
     </w:p>
@@ -6275,7 +6620,7 @@
               <w:rPr>
                 <w:b/>
               </w:rPr>
-              <w:t>Xem Trang chủ &amp; Tin tức</w:t>
+              <w:t>Xem Trang chủ &amp; Banner sự kiện</w:t>
             </w:r>
           </w:p>
         </w:tc>
@@ -6291,7 +6636,7 @@
           </w:tcPr>
           <w:p>
             <w:r>
-              <w:t>Đoàn viên và độc giả xem tin tức sự kiện theo bố cục lưới 2 cột tỷ lệ 9:3 chuẩn nhận diện TDMU, xem banner slide chuyển động.</w:t>
+              <w:t>Đoàn viên và độc giả truy cập trang chủ, xem banner trình chiếu các sự kiện nổi bật, tin tức mới nhất và các hoạt động công đoàn tiêu biểu.</w:t>
             </w:r>
           </w:p>
         </w:tc>
@@ -6328,7 +6673,7 @@
               <w:rPr>
                 <w:b/>
               </w:rPr>
-              <w:t>Tìm kiếm bài viết</w:t>
+              <w:t>Lọc tin theo Chuyên mục</w:t>
             </w:r>
           </w:p>
         </w:tc>
@@ -6344,7 +6689,7 @@
           </w:tcPr>
           <w:p>
             <w:r>
-              <w:t>Người dùng nhập từ khóa vào thanh tìm kiếm để tra cứu nhanh tin bài, văn bản theo tiêu đề hoặc nội dung tóm tắt.</w:t>
+              <w:t>Người xem lọc bài viết theo các chuyên mục chuyên biệt: Hoạt động phong trào, Tuyên truyền giáo dục, Chế độ chính sách - Pháp luật, Hoạt động Nữ công, Thi đua - Khen thưởng.</w:t>
             </w:r>
           </w:p>
         </w:tc>
@@ -6381,7 +6726,7 @@
               <w:rPr>
                 <w:b/>
               </w:rPr>
-              <w:t>Lọc tin theo danh mục</w:t>
+              <w:t>Tìm kiếm bài viết nâng cao</w:t>
             </w:r>
           </w:p>
         </w:tc>
@@ -6397,7 +6742,7 @@
           </w:tcPr>
           <w:p>
             <w:r>
-              <w:t>Người xem có thể lọc tin tức theo các chuyên mục: Hoạt động Công đoàn, Tuyên truyền giáo dục, Phong trào thi đua, Nữ công.</w:t>
+              <w:t>Tìm kiếm nhanh các bài viết theo từ khóa tiêu đề, nội dung tóm tắt, tên tác giả hoặc khoảng thời gian phát hành.</w:t>
             </w:r>
           </w:p>
         </w:tc>
@@ -6434,7 +6779,7 @@
               <w:rPr>
                 <w:b/>
               </w:rPr>
-              <w:t>Tra cứu Cơ cấu tổ chức</w:t>
+              <w:t>Xem Chi tiết bài viết đa phương tiện</w:t>
             </w:r>
           </w:p>
         </w:tc>
@@ -6450,7 +6795,7 @@
           </w:tcPr>
           <w:p>
             <w:r>
-              <w:t>Xem thông tin chi tiết danh sách 13 ủy viên Ban Chấp hành, 3 ủy viên Ủy ban Kiểm tra và 4 Ban chuyên môn kèm email liên hệ.</w:t>
+              <w:t>Đọc nội dung bài viết với giao diện chuẩn báo chí, xem album hình ảnh sự kiện chất lượng cao và xem video clip minh họa nhúng trong bài viết.</w:t>
             </w:r>
           </w:p>
         </w:tc>
@@ -6487,7 +6832,7 @@
               <w:rPr>
                 <w:b/>
               </w:rPr>
-              <w:t>Xem Bảng Thi đua 16 Tổ</w:t>
+              <w:t>Tương tác Thích (Like) bài viết</w:t>
             </w:r>
           </w:p>
         </w:tc>
@@ -6503,7 +6848,7 @@
           </w:tcPr>
           <w:p>
             <w:r>
-              <w:t>Xem bảng tổng hợp thi đua thời gian thực của 16 Tổ Công đoàn, xem 4 thẻ đo lường KPI (tiến độ nộp, đoàn viên, tiền chăm lo, tỷ lệ %).</w:t>
+              <w:t>Đoàn viên bày tỏ sự quan tâm, yêu thích đối với bài viết thông qua nút Like; hệ thống tự động cập nhật số lượt thích thời gian thực.</w:t>
             </w:r>
           </w:p>
         </w:tc>
@@ -6540,7 +6885,7 @@
               <w:rPr>
                 <w:b/>
               </w:rPr>
-              <w:t>Xem Chi tiết Báo cáo Tổ</w:t>
+              <w:t>Gửi Bình luận (Comment)</w:t>
             </w:r>
           </w:p>
         </w:tc>
@@ -6556,7 +6901,7 @@
           </w:tcPr>
           <w:p>
             <w:r>
-              <w:t>Bấm nút 'Xem' để mở Modal hiển thị trọn vẹn 24 chỉ tiêu số liệu của Tổ Công đoàn và xem link Google Drive minh chứng.</w:t>
+              <w:t>Người đọc để lại ý kiến đóng góp, thảo luận dưới bài viết (hỗ trợ kiểm duyệt bình luận văn minh trước khi hiển thị).</w:t>
             </w:r>
           </w:p>
         </w:tc>
@@ -6593,7 +6938,7 @@
               <w:rPr>
                 <w:b/>
               </w:rPr>
-              <w:t>Nộp Báo cáo Tháng Online</w:t>
+              <w:t>Chia sẻ bài viết đa kênh</w:t>
             </w:r>
           </w:p>
         </w:tc>
@@ -6609,7 +6954,7 @@
           </w:tcPr>
           <w:p>
             <w:r>
-              <w:t>Tổ trưởng 16 Tổ điền và gửi Báo cáo Tháng trực tuyến theo 24 chỉ tiêu chuẩn Google Forms; hệ thống tự động ghi nhận tức thì vào CSDL.</w:t>
+              <w:t>Cung cấp nút chia sẻ nhanh bài viết lên mạng xã hội Facebook, Zalo hoặc sao chép đường dẫn (link) bài viết.</w:t>
             </w:r>
           </w:p>
         </w:tc>
@@ -6646,7 +6991,7 @@
               <w:rPr>
                 <w:b/>
               </w:rPr>
-              <w:t>Truy cập Google Form gốc</w:t>
+              <w:t>Xem Thông báo &amp; Lịch công tác</w:t>
             </w:r>
           </w:p>
         </w:tc>
@@ -6662,7 +7007,7 @@
           </w:tcPr>
           <w:p>
             <w:r>
-              <w:t>Nút bấm nổi bật màu đỏ tại Top Header và Banner mở trực tiếp biểu mẫu Google Forms chính thức của trường.</w:t>
+              <w:t>Xem danh sách các thông báo chính thức của Ban Thường vụ Công đoàn và theo dõi lịch công tác tuần/tháng.</w:t>
             </w:r>
           </w:p>
         </w:tc>
@@ -6699,7 +7044,7 @@
               <w:rPr>
                 <w:b/>
               </w:rPr>
-              <w:t>Tải Văn bản &amp; Biểu mẫu</w:t>
+              <w:t>Tra cứu Văn bản &amp; Biểu mẫu</w:t>
             </w:r>
           </w:p>
         </w:tc>
@@ -6715,7 +7060,7 @@
           </w:tcPr>
           <w:p>
             <w:r>
-              <w:t>Tra cứu và tải tệp tin (.pdf, .docx, .xlsx) theo 4 phân loại văn bản chuẩn và danh mục biểu mẫu nghiệp vụ.</w:t>
+              <w:t>Tra cứu, xem trước và tải về các văn bản quy phạm, hướng dẫn nghiệp vụ và biểu mẫu công đoàn (.pdf, .docx, .xlsx).</w:t>
             </w:r>
           </w:p>
         </w:tc>
@@ -6752,7 +7097,7 @@
               <w:rPr>
                 <w:b/>
               </w:rPr>
-              <w:t>Gửi Đơn trợ cấp &amp; Ý kiến</w:t>
+              <w:t>Giao diện Responsive trên Di động</w:t>
             </w:r>
           </w:p>
         </w:tc>
@@ -6768,7 +7113,7 @@
           </w:tcPr>
           <w:p>
             <w:r>
-              <w:t>Đoàn viên điền biểu mẫu trực tuyến đề nghị hỗ trợ khó khăn, bệnh hiểm nghèo và gửi góp ý trực tiếp đến Ban Thường vụ.</w:t>
+              <w:t>Giao diện tự động tối ưu hóa trải nghiệm hiển thị và thao tác cảm ứng trên mọi kích cỡ màn hình điện thoại thông minh và máy tính bảng.</w:t>
             </w:r>
           </w:p>
         </w:tc>
@@ -6910,7 +7255,7 @@
               <w:rPr>
                 <w:b/>
               </w:rPr>
-              <w:t>Quản lý Báo cáo Thi đua</w:t>
+              <w:t>Quản lý Tài khoản &amp; Phân quyền (RBAC)</w:t>
             </w:r>
           </w:p>
         </w:tc>
@@ -6926,15 +7271,7 @@
           </w:tcPr>
           <w:p>
             <w:r>
-              <w:t>Quản lý toàn bộ số liệu báo cáo của 16 Tổ Công đoàn. Người quản trị có thể thực hiện:</w:t>
-              <w:br/>
-              <w:t>+ Lọc báo cáo theo Tháng và Năm</w:t>
-              <w:br/>
-              <w:t>+ Xem chi tiết 24 chỉ tiêu của từng đơn vị</w:t>
-              <w:br/>
-              <w:t>+ Truy cập link Drive minh chứng để thẩm định</w:t>
-              <w:br/>
-              <w:t>+ Xuất bảng tổng hợp số liệu ra tệp Excel (.xlsx)</w:t>
+              <w:t>Quản lý danh sách người dùng, cấp phát tài khoản và phân chia 3 vai trò quyền hạn chặt chẽ: Quản trị viên (Admin), Biên tập viên (Editor), Cộng tác viên (Contributor).</w:t>
             </w:r>
           </w:p>
         </w:tc>
@@ -6971,7 +7308,7 @@
               <w:rPr>
                 <w:b/>
               </w:rPr>
-              <w:t>Quản lý Tin tức (CMS)</w:t>
+              <w:t>Quản lý Chuyên mục Truyền thông</w:t>
             </w:r>
           </w:p>
         </w:tc>
@@ -6987,7 +7324,7 @@
           </w:tcPr>
           <w:p>
             <w:r>
-              <w:t>Quản lý tin tức truyền thông: Thêm bài viết mới, chỉnh sửa, xóa tin tức, upload hình ảnh thumbnail bài viết.</w:t>
+              <w:t>Quản lý hệ thống cây phân mục tin tức, sự kiện; thêm mới, chỉnh sửa tên, mô tả chuyên mục và sắp xếp thứ tự hiển thị trên Website.</w:t>
             </w:r>
           </w:p>
         </w:tc>
@@ -7024,7 +7361,7 @@
               <w:rPr>
                 <w:b/>
               </w:rPr>
-              <w:t>Phê duyệt Bài viết 4 Bước</w:t>
+              <w:t>Tạo và Biên tập Bài viết (Rich Text CMS)</w:t>
             </w:r>
           </w:p>
         </w:tc>
@@ -7040,7 +7377,7 @@
           </w:tcPr>
           <w:p>
             <w:r>
-              <w:t>Kiểm duyệt nội dung bài viết theo quy trình 4 trạng thái: Bản nháp -&gt; Chờ duyệt -&gt; Đã duyệt -&gt; Xuất bản ra Trang chủ.</w:t>
+              <w:t>Cung cấp trình soạn thảo trực quan (WYSIWYG), hỗ trợ định dạng chữ phong phú, căn lề, chèn bảng, tạo khối trích dẫn và quản lý phiên bản nội dung bài viết.</w:t>
             </w:r>
           </w:p>
         </w:tc>
@@ -7077,7 +7414,7 @@
               <w:rPr>
                 <w:b/>
               </w:rPr>
-              <w:t>Trợ lý AI Tạo Bài Viết</w:t>
+              <w:t>Quản lý Kho Media (Hình ảnh &amp; Video)</w:t>
             </w:r>
           </w:p>
         </w:tc>
@@ -7093,7 +7430,7 @@
           </w:tcPr>
           <w:p>
             <w:r>
-              <w:t>Sử dụng mô hình Google Gemini 2.5 Flash / Groq LLM để tự động sinh bài báo hoàn chỉnh từ từ khóa hoặc dàn ý.</w:t>
+              <w:t>Quản lý tập trung kho hình ảnh và video sự kiện; cho phép upload nhiều file đồng thời, nén tối ưu dung lượng ảnh, chèn ảnh đại diện (thumbnail) và nhúng video vào bài viết.</w:t>
             </w:r>
           </w:p>
         </w:tc>
@@ -7130,7 +7467,7 @@
               <w:rPr>
                 <w:b/>
               </w:rPr>
-              <w:t>Trợ lý AI Tóm Tắt (NLP)</w:t>
+              <w:t>Kiểm duyệt Bài viết 4 Bước</w:t>
             </w:r>
           </w:p>
         </w:tc>
@@ -7146,7 +7483,7 @@
           </w:tcPr>
           <w:p>
             <w:r>
-              <w:t>Ứng dụng thuật toán Sentence Ranking nội bộ để tự động trích xuất tóm tắt bài báo 2 câu chuẩn xác mà không cần Internet.</w:t>
+              <w:t>Kiểm duyệt nội dung bài viết theo quy trình khép kín: Bản nháp (Draft) -&gt; Chờ duyệt (Pending) -&gt; Đã duyệt (Approved) -&gt; Xuất bản (Published) / Lên lịch (Scheduled).</w:t>
             </w:r>
           </w:p>
         </w:tc>
@@ -7183,7 +7520,7 @@
               <w:rPr>
                 <w:b/>
               </w:rPr>
-              <w:t>Trích xuất Từ khóa SEO</w:t>
+              <w:t>Trợ lý AI - Tạo Bản thảo Bài viết</w:t>
             </w:r>
           </w:p>
         </w:tc>
@@ -7199,7 +7536,7 @@
           </w:tcPr>
           <w:p>
             <w:r>
-              <w:t>Ứng dụng thuật toán TF-IDF nội bộ loại bỏ từ dừng (Stopwords) tiếng Việt và trích xuất top 6 từ khóa quan trọng nhất.</w:t>
+              <w:t>Tích hợp mô hình AI ngôn ngữ lớn (OpenAI GPT / Google Gemini) hỗ trợ tự động sinh bài viết truyền thông hoàn chỉnh từ từ khóa hoặc dàn ý thô của sự kiện.</w:t>
             </w:r>
           </w:p>
         </w:tc>
@@ -7236,7 +7573,7 @@
               <w:rPr>
                 <w:b/>
               </w:rPr>
-              <w:t>Quản lý Danh mục Tin</w:t>
+              <w:t>Trợ lý AI - Gợi ý Tiêu đề &amp; Tóm tắt</w:t>
             </w:r>
           </w:p>
         </w:tc>
@@ -7252,7 +7589,7 @@
           </w:tcPr>
           <w:p>
             <w:r>
-              <w:t>Quản lý các chuyên mục bài viết: Thêm, sửa, xóa danh mục tin tức và phong trào.</w:t>
+              <w:t>AI tự động phân tích bài viết để đề xuất nhiều phương án tiêu đề thu hút, chuẩn văn phong báo chí đoàn thể; tự động trích xuất đoạn tóm tắt (Sapo/Lead) ngắn gọn.</w:t>
             </w:r>
           </w:p>
         </w:tc>
@@ -7289,7 +7626,7 @@
               <w:rPr>
                 <w:b/>
               </w:rPr>
-              <w:t>Quản lý Kho Văn bản</w:t>
+              <w:t>Trợ lý AI - Hỗ trợ Hình ảnh &amp; Video</w:t>
             </w:r>
           </w:p>
         </w:tc>
@@ -7305,7 +7642,7 @@
           </w:tcPr>
           <w:p>
             <w:r>
-              <w:t>Quản lý các văn bản chỉ đạo theo 4 nhóm chuẩn: Công văn tuyên truyền, Kế hoạch, Luật, Quyết định.</w:t>
+              <w:t>AI hỗ trợ gợi ý ý tưởng bố cục hình ảnh, sinh câu lệnh prompt tạo ảnh banner minh họa sự kiện và gợi ý kịch bản, dàn ý sản xuất video ngắn (Shorts/Reels) tóm tắt hoạt động.</w:t>
             </w:r>
           </w:p>
         </w:tc>
@@ -7342,7 +7679,7 @@
               <w:rPr>
                 <w:b/>
               </w:rPr>
-              <w:t>Quản lý Biểu mẫu</w:t>
+              <w:t>Quản lý Lịch Đăng (Scheduler &amp; Cronjob)</w:t>
             </w:r>
           </w:p>
         </w:tc>
@@ -7358,7 +7695,7 @@
           </w:tcPr>
           <w:p>
             <w:r>
-              <w:t>Đăng tải và cập nhật các biểu mẫu nghiệp vụ, hồ sơ khen thưởng, mẫu đơn gia nhập công đoàn.</w:t>
+              <w:t>Thiết lập lịch hẹn ngày/giờ xuất bản bài viết tự động; hệ thống tự động kích hoạt xuất bản đúng thời điểm mà không cần cán bộ phải trực tiếp mở máy thao tác.</w:t>
             </w:r>
           </w:p>
         </w:tc>
@@ -7395,7 +7732,7 @@
               <w:rPr>
                 <w:b/>
               </w:rPr>
-              <w:t>Quản lý Đơn trợ cấp</w:t>
+              <w:t>Tự động Đăng tải lên Fanpage Facebook</w:t>
             </w:r>
           </w:p>
         </w:tc>
@@ -7411,7 +7748,7 @@
           </w:tcPr>
           <w:p>
             <w:r>
-              <w:t>Tiếp nhận hồ sơ xin trợ cấp khó khăn, bệnh hiểm nghèo của đoàn viên; phê duyệt mức hỗ trợ và chuyển trạng thái 'Đã chi'.</w:t>
+              <w:t>Tích hợp Facebook Graph API để xuất bản đồng thời nội dung, ảnh bìa và link bài viết từ Website lên Fanpage Facebook Công đoàn TDMU chỉ với 1 cú click chuột.</w:t>
             </w:r>
           </w:p>
         </w:tc>
@@ -7448,7 +7785,7 @@
               <w:rPr>
                 <w:b/>
               </w:rPr>
-              <w:t>Quản lý Ý kiến phản ánh</w:t>
+              <w:t>Đo lường &amp; Thống kê Tương tác (Dashboard)</w:t>
             </w:r>
           </w:p>
         </w:tc>
@@ -7464,7 +7801,7 @@
           </w:tcPr>
           <w:p>
             <w:r>
-              <w:t>Tiếp nhận phản ánh từ hòm thư điện tử; phản hồi giải đáp ý kiến của cán bộ giảng viên.</w:t>
+              <w:t>Bảng điều khiển trực quan hiển thị số liệu định lượng: Tổng lượt xem, lượt thích, bình luận, chia sẻ bài viết trên Website và tương tác từ Fanpage Facebook.</w:t>
             </w:r>
           </w:p>
         </w:tc>
@@ -7501,7 +7838,7 @@
               <w:rPr>
                 <w:b/>
               </w:rPr>
-              <w:t>Quản lý Người dùng &amp; RBAC</w:t>
+              <w:t>Báo cáo Xếp hạng Hiệu quả Truyền thông</w:t>
             </w:r>
           </w:p>
         </w:tc>
@@ -7517,7 +7854,7 @@
           </w:tcPr>
           <w:p>
             <w:r>
-              <w:t>Quản lý danh sách tài khoản; phân quyền theo 3 cấp chuẩn học thuật: Quản trị viên, Biên tập viên, Cộng tác viên.</w:t>
+              <w:t>Biểu đồ trực quan xếp hạng Top bài viết được quan tâm nhiều nhất theo tuần, tháng, quý; thống kê xu hướng chủ đề thu hút phục vụ công tác báo cáo của Công đoàn.</w:t>
             </w:r>
           </w:p>
         </w:tc>
@@ -7554,7 +7891,7 @@
               <w:rPr>
                 <w:b/>
               </w:rPr>
-              <w:t>Quản trị Cơ sở Dữ liệu</w:t>
+              <w:t>Cấu hình Hệ thống &amp; Khóa API</w:t>
             </w:r>
           </w:p>
         </w:tc>
@@ -7570,7 +7907,7 @@
           </w:tcPr>
           <w:p>
             <w:r>
-              <w:t>Giám sát đồng bộ dữ liệu giữa Microsoft SQL Server và JSON Engine dự phòng; sao lưu và phục hồi hệ thống.</w:t>
+              <w:t>Quản lý các tham số cấu hình: Cài đặt API Key của OpenAI / Gemini, cấu hình Facebook Fanpage Page ID &amp; Access Token, cấu hình sao lưu CSDL MySQL an toàn.</w:t>
             </w:r>
           </w:p>
         </w:tc>

</xml_diff>